<commit_message>
Updated Assembly programs, using the custom lib I created
</commit_message>
<xml_diff>
--- a/Fundamental-of-computational-systems/lab-3/plantillaReportes.docx
+++ b/Fundamental-of-computational-systems/lab-3/plantillaReportes.docx
@@ -8,6 +8,7 @@
         <w:spacing w:before="68"/>
         <w:ind w:left="974" w:right="1338"/>
       </w:pPr>
+      <w:bookmarkStart w:id="0" w:name="_Toc233489388"/>
       <w:r>
         <w:t>PONTIFICIA</w:t>
       </w:r>
@@ -56,6 +57,7 @@
       <w:r>
         <w:t>MAESTRA FACULTAD DE CIENCIAS E INGENIERÍA</w:t>
       </w:r>
+      <w:bookmarkEnd w:id="0"/>
     </w:p>
     <w:p>
       <w:pPr>
@@ -190,7 +192,7 @@
           <w:sz w:val="20"/>
         </w:rPr>
         <w:drawing>
-          <wp:anchor distT="0" distB="0" distL="0" distR="0" simplePos="0" relativeHeight="487587840" behindDoc="1" locked="0" layoutInCell="1" allowOverlap="1" wp14:anchorId="4C36A5CF" wp14:editId="6783C6AC">
+          <wp:anchor distT="0" distB="0" distL="0" distR="0" simplePos="0" relativeHeight="251657216" behindDoc="1" locked="0" layoutInCell="1" allowOverlap="1" wp14:anchorId="4C36A5CF" wp14:editId="6783C6AC">
             <wp:simplePos x="0" y="0"/>
             <wp:positionH relativeFrom="page">
               <wp:posOffset>2933700</wp:posOffset>
@@ -213,7 +215,7 @@
                     <pic:cNvPicPr/>
                   </pic:nvPicPr>
                   <pic:blipFill>
-                    <a:blip r:embed="rId5" cstate="print"/>
+                    <a:blip r:embed="rId6" cstate="print"/>
                     <a:stretch>
                       <a:fillRect/>
                     </a:stretch>
@@ -244,6 +246,7 @@
           <w:iCs/>
         </w:rPr>
       </w:pPr>
+      <w:bookmarkStart w:id="1" w:name="_Toc233489389"/>
       <w:r>
         <w:rPr>
           <w:i/>
@@ -251,6 +254,7 @@
         </w:rPr>
         <w:t>Fundamentos de Sistemas computacionales</w:t>
       </w:r>
+      <w:bookmarkEnd w:id="1"/>
     </w:p>
     <w:p>
       <w:pPr>
@@ -265,12 +269,14 @@
       <w:r>
         <w:t xml:space="preserve"> </w:t>
       </w:r>
-      <w:r>
-        <w:rPr>
-          <w:lang w:val="en-US"/>
+      <w:bookmarkStart w:id="2" w:name="_Toc233489390"/>
+      <w:r>
+        <w:rPr>
+          <w:lang w:val="es-DO"/>
         </w:rPr>
         <w:t>5176</w:t>
       </w:r>
+      <w:bookmarkEnd w:id="2"/>
     </w:p>
     <w:p>
       <w:pPr>
@@ -302,6 +308,7 @@
         <w:jc w:val="center"/>
         <w:rPr>
           <w:b/>
+          <w:spacing w:val="-5"/>
           <w:sz w:val="24"/>
         </w:rPr>
       </w:pPr>
@@ -335,6 +342,15 @@
           <w:sz w:val="24"/>
         </w:rPr>
         <w:t>1</w:t>
+      </w:r>
+      <w:r>
+        <w:rPr>
+          <w:b/>
+          <w:spacing w:val="-5"/>
+          <w:sz w:val="24"/>
+        </w:rPr>
+        <w:br/>
+        <w:t>Trabajo de Ensamblador – Lab. 3</w:t>
       </w:r>
     </w:p>
     <w:p>
@@ -368,6 +384,7 @@
           <w:spacing w:val="-2"/>
         </w:rPr>
       </w:pPr>
+      <w:bookmarkStart w:id="3" w:name="_Toc233489391"/>
       <w:r>
         <w:rPr>
           <w:smallCaps/>
@@ -375,6 +392,7 @@
         </w:rPr>
         <w:t>Estudiante:</w:t>
       </w:r>
+      <w:bookmarkEnd w:id="3"/>
     </w:p>
     <w:p>
       <w:pPr>
@@ -385,6 +403,7 @@
           <w:spacing w:val="-2"/>
         </w:rPr>
       </w:pPr>
+      <w:bookmarkStart w:id="4" w:name="_Toc233489392"/>
       <w:r>
         <w:rPr>
           <w:smallCaps/>
@@ -416,6 +435,7 @@
         </w:rPr>
         <w:t>taveras</w:t>
       </w:r>
+      <w:bookmarkEnd w:id="4"/>
       <w:proofErr w:type="spellEnd"/>
     </w:p>
     <w:p>
@@ -423,6 +443,7 @@
         <w:pStyle w:val="Heading1"/>
         <w:ind w:right="354"/>
       </w:pPr>
+      <w:bookmarkStart w:id="5" w:name="_Toc233489393"/>
       <w:r>
         <w:rPr>
           <w:smallCaps/>
@@ -430,6 +451,7 @@
         </w:rPr>
         <w:t>___________________________________</w:t>
       </w:r>
+      <w:bookmarkEnd w:id="5"/>
     </w:p>
     <w:p>
       <w:pPr>
@@ -461,6 +483,7 @@
         <w:pStyle w:val="Heading1"/>
         <w:ind w:left="974" w:right="1331"/>
       </w:pPr>
+      <w:bookmarkStart w:id="6" w:name="_Toc233489394"/>
       <w:r>
         <w:rPr>
           <w:smallCaps/>
@@ -468,6 +491,7 @@
         </w:rPr>
         <w:t>Docente:</w:t>
       </w:r>
+      <w:bookmarkEnd w:id="6"/>
     </w:p>
     <w:p>
       <w:pPr>
@@ -552,6 +576,7 @@
           <w:spacing w:val="-2"/>
         </w:rPr>
       </w:pPr>
+      <w:bookmarkStart w:id="7" w:name="_Toc233489395"/>
       <w:r>
         <w:rPr>
           <w:smallCaps/>
@@ -585,15 +610,21 @@
         </w:rPr>
         <w:t>entrega:</w:t>
       </w:r>
+      <w:bookmarkEnd w:id="7"/>
     </w:p>
     <w:p>
       <w:pPr>
         <w:pStyle w:val="Heading1"/>
         <w:ind w:left="974" w:right="1331"/>
       </w:pPr>
-      <w:r>
-        <w:t>23/6/2026</w:t>
-      </w:r>
+      <w:bookmarkStart w:id="8" w:name="_Toc233489396"/>
+      <w:r>
+        <w:t>30</w:t>
+      </w:r>
+      <w:r>
+        <w:t>/6/2026</w:t>
+      </w:r>
+      <w:bookmarkEnd w:id="8"/>
     </w:p>
     <w:p>
       <w:pPr>
@@ -630,6 +661,7 @@
         <w:pStyle w:val="Heading1"/>
         <w:ind w:left="2821" w:right="3178"/>
       </w:pPr>
+      <w:bookmarkStart w:id="9" w:name="_Toc233489397"/>
       <w:r>
         <w:t>Santiago</w:t>
       </w:r>
@@ -660,6 +692,7 @@
       <w:r>
         <w:t>Caballeros, República Dominicana</w:t>
       </w:r>
+      <w:bookmarkEnd w:id="9"/>
     </w:p>
     <w:p>
       <w:pPr>
@@ -686,36 +719,136 @@
     </w:p>
     <w:sdt>
       <w:sdtPr>
-        <w:id w:val="1198743536"/>
+        <w:rPr>
+          <w:lang w:val="es-DO"/>
+        </w:rPr>
+        <w:id w:val="-1946377264"/>
         <w:docPartObj>
           <w:docPartGallery w:val="Table of Contents"/>
           <w:docPartUnique/>
         </w:docPartObj>
       </w:sdtPr>
+      <w:sdtEndPr>
+        <w:rPr>
+          <w:rFonts w:ascii="Times New Roman" w:eastAsia="Times New Roman" w:hAnsi="Times New Roman" w:cs="Times New Roman"/>
+          <w:b/>
+          <w:bCs/>
+          <w:noProof/>
+          <w:color w:val="auto"/>
+          <w:sz w:val="22"/>
+          <w:szCs w:val="22"/>
+        </w:rPr>
+      </w:sdtEndPr>
       <w:sdtContent>
+        <w:p>
+          <w:pPr>
+            <w:pStyle w:val="TOCHeading"/>
+            <w:rPr>
+              <w:lang w:val="es-DO"/>
+            </w:rPr>
+          </w:pPr>
+          <w:r>
+            <w:rPr>
+              <w:lang w:val="es-DO"/>
+            </w:rPr>
+            <w:t>Contenido del reporte</w:t>
+          </w:r>
+        </w:p>
         <w:p>
           <w:pPr>
             <w:pStyle w:val="TOC1"/>
             <w:tabs>
-              <w:tab w:val="right" w:leader="dot" w:pos="9352"/>
+              <w:tab w:val="right" w:leader="dot" w:pos="9710"/>
             </w:tabs>
-            <w:spacing w:before="28"/>
+            <w:rPr>
+              <w:rFonts w:asciiTheme="minorHAnsi" w:eastAsiaTheme="minorEastAsia" w:hAnsiTheme="minorHAnsi" w:cstheme="minorBidi"/>
+              <w:noProof/>
+              <w:kern w:val="2"/>
+              <w:lang w:val="es-DO" w:eastAsia="zh-TW"/>
+              <w14:ligatures w14:val="standardContextual"/>
+            </w:rPr>
           </w:pPr>
-          <w:hyperlink w:anchor="_bookmark0" w:history="1">
-            <w:r>
-              <w:rPr>
-                <w:spacing w:val="-2"/>
-              </w:rPr>
-              <w:t>Introducción:</w:t>
-            </w:r>
-            <w:r>
+          <w:r>
+            <w:rPr>
+              <w:lang w:val="es-DO"/>
+            </w:rPr>
+            <w:fldChar w:fldCharType="begin"/>
+          </w:r>
+          <w:r>
+            <w:rPr>
+              <w:lang w:val="es-DO"/>
+            </w:rPr>
+            <w:instrText xml:space="preserve"> TOC \o "1-3" \h \z \u </w:instrText>
+          </w:r>
+          <w:r>
+            <w:rPr>
+              <w:lang w:val="es-DO"/>
+            </w:rPr>
+            <w:fldChar w:fldCharType="separate"/>
+          </w:r>
+          <w:hyperlink w:anchor="_Toc233489398" w:history="1">
+            <w:r>
+              <w:rPr>
+                <w:rStyle w:val="Hyperlink"/>
+                <w:noProof/>
+                <w:lang w:val="es-DO"/>
+              </w:rPr>
+              <w:t>Introducción</w:t>
+            </w:r>
+            <w:r>
+              <w:rPr>
+                <w:noProof/>
+                <w:webHidden/>
+                <w:lang w:val="es-DO"/>
+              </w:rPr>
               <w:tab/>
             </w:r>
             <w:r>
               <w:rPr>
-                <w:spacing w:val="-10"/>
+                <w:noProof/>
+                <w:webHidden/>
+                <w:lang w:val="es-DO"/>
+              </w:rPr>
+              <w:fldChar w:fldCharType="begin"/>
+            </w:r>
+            <w:r>
+              <w:rPr>
+                <w:noProof/>
+                <w:webHidden/>
+                <w:lang w:val="es-DO"/>
+              </w:rPr>
+              <w:instrText xml:space="preserve"> PAGEREF _Toc233489398 \h </w:instrText>
+            </w:r>
+            <w:r>
+              <w:rPr>
+                <w:noProof/>
+                <w:webHidden/>
+                <w:lang w:val="es-DO"/>
+              </w:rPr>
+            </w:r>
+            <w:r>
+              <w:rPr>
+                <w:noProof/>
+                <w:webHidden/>
+                <w:lang w:val="es-DO"/>
+              </w:rPr>
+              <w:fldChar w:fldCharType="separate"/>
+            </w:r>
+            <w:r>
+              <w:rPr>
+                <w:noProof/>
+                <w:webHidden/>
+                <w:lang w:val="es-DO"/>
               </w:rPr>
               <w:t>3</w:t>
+            </w:r>
+            <w:r>
+              <w:rPr>
+                <w:noProof/>
+                <w:webHidden/>
+                <w:lang w:val="es-DO"/>
+              </w:rPr>
+              <w:fldChar w:fldCharType="end"/>
             </w:r>
           </w:hyperlink>
         </w:p>
@@ -723,24 +856,79 @@
           <w:pPr>
             <w:pStyle w:val="TOC1"/>
             <w:tabs>
-              <w:tab w:val="right" w:leader="dot" w:pos="9352"/>
+              <w:tab w:val="right" w:leader="dot" w:pos="9710"/>
             </w:tabs>
+            <w:rPr>
+              <w:rFonts w:asciiTheme="minorHAnsi" w:eastAsiaTheme="minorEastAsia" w:hAnsiTheme="minorHAnsi" w:cstheme="minorBidi"/>
+              <w:noProof/>
+              <w:kern w:val="2"/>
+              <w:lang w:val="es-DO" w:eastAsia="zh-TW"/>
+              <w14:ligatures w14:val="standardContextual"/>
+            </w:rPr>
           </w:pPr>
-          <w:hyperlink w:anchor="_bookmark1" w:history="1">
-            <w:r>
-              <w:rPr>
-                <w:spacing w:val="-2"/>
-              </w:rPr>
-              <w:t>Objetivos:</w:t>
-            </w:r>
-            <w:r>
+          <w:hyperlink w:anchor="_Toc233489399" w:history="1">
+            <w:r>
+              <w:rPr>
+                <w:rStyle w:val="Hyperlink"/>
+                <w:noProof/>
+                <w:lang w:val="es-DO"/>
+              </w:rPr>
+              <w:t>Objetivos</w:t>
+            </w:r>
+            <w:r>
+              <w:rPr>
+                <w:noProof/>
+                <w:webHidden/>
+                <w:lang w:val="es-DO"/>
+              </w:rPr>
               <w:tab/>
             </w:r>
             <w:r>
               <w:rPr>
-                <w:spacing w:val="-10"/>
+                <w:noProof/>
+                <w:webHidden/>
+                <w:lang w:val="es-DO"/>
+              </w:rPr>
+              <w:fldChar w:fldCharType="begin"/>
+            </w:r>
+            <w:r>
+              <w:rPr>
+                <w:noProof/>
+                <w:webHidden/>
+                <w:lang w:val="es-DO"/>
+              </w:rPr>
+              <w:instrText xml:space="preserve"> PAGEREF _Toc233489399 \h </w:instrText>
+            </w:r>
+            <w:r>
+              <w:rPr>
+                <w:noProof/>
+                <w:webHidden/>
+                <w:lang w:val="es-DO"/>
+              </w:rPr>
+            </w:r>
+            <w:r>
+              <w:rPr>
+                <w:noProof/>
+                <w:webHidden/>
+                <w:lang w:val="es-DO"/>
+              </w:rPr>
+              <w:fldChar w:fldCharType="separate"/>
+            </w:r>
+            <w:r>
+              <w:rPr>
+                <w:noProof/>
+                <w:webHidden/>
+                <w:lang w:val="es-DO"/>
               </w:rPr>
               <w:t>4</w:t>
+            </w:r>
+            <w:r>
+              <w:rPr>
+                <w:noProof/>
+                <w:webHidden/>
+                <w:lang w:val="es-DO"/>
+              </w:rPr>
+              <w:fldChar w:fldCharType="end"/>
             </w:r>
           </w:hyperlink>
         </w:p>
@@ -748,33 +936,79 @@
           <w:pPr>
             <w:pStyle w:val="TOC1"/>
             <w:tabs>
-              <w:tab w:val="right" w:leader="dot" w:pos="9352"/>
+              <w:tab w:val="right" w:leader="dot" w:pos="9710"/>
             </w:tabs>
+            <w:rPr>
+              <w:rFonts w:asciiTheme="minorHAnsi" w:eastAsiaTheme="minorEastAsia" w:hAnsiTheme="minorHAnsi" w:cstheme="minorBidi"/>
+              <w:noProof/>
+              <w:kern w:val="2"/>
+              <w:lang w:val="es-DO" w:eastAsia="zh-TW"/>
+              <w14:ligatures w14:val="standardContextual"/>
+            </w:rPr>
           </w:pPr>
-          <w:hyperlink w:anchor="_bookmark3" w:history="1">
-            <w:r>
-              <w:t>Marco</w:t>
-            </w:r>
-            <w:r>
-              <w:rPr>
-                <w:spacing w:val="-3"/>
-              </w:rPr>
-              <w:t xml:space="preserve"> </w:t>
-            </w:r>
-            <w:r>
-              <w:rPr>
-                <w:spacing w:val="-2"/>
-              </w:rPr>
-              <w:t>teórico:</w:t>
-            </w:r>
-            <w:r>
+          <w:hyperlink w:anchor="_Toc233489400" w:history="1">
+            <w:r>
+              <w:rPr>
+                <w:rStyle w:val="Hyperlink"/>
+                <w:noProof/>
+                <w:lang w:val="es-DO"/>
+              </w:rPr>
+              <w:t>Marco Teórico</w:t>
+            </w:r>
+            <w:r>
+              <w:rPr>
+                <w:noProof/>
+                <w:webHidden/>
+                <w:lang w:val="es-DO"/>
+              </w:rPr>
               <w:tab/>
             </w:r>
             <w:r>
               <w:rPr>
-                <w:spacing w:val="-10"/>
+                <w:noProof/>
+                <w:webHidden/>
+                <w:lang w:val="es-DO"/>
+              </w:rPr>
+              <w:fldChar w:fldCharType="begin"/>
+            </w:r>
+            <w:r>
+              <w:rPr>
+                <w:noProof/>
+                <w:webHidden/>
+                <w:lang w:val="es-DO"/>
+              </w:rPr>
+              <w:instrText xml:space="preserve"> PAGEREF _Toc233489400 \h </w:instrText>
+            </w:r>
+            <w:r>
+              <w:rPr>
+                <w:noProof/>
+                <w:webHidden/>
+                <w:lang w:val="es-DO"/>
+              </w:rPr>
+            </w:r>
+            <w:r>
+              <w:rPr>
+                <w:noProof/>
+                <w:webHidden/>
+                <w:lang w:val="es-DO"/>
+              </w:rPr>
+              <w:fldChar w:fldCharType="separate"/>
+            </w:r>
+            <w:r>
+              <w:rPr>
+                <w:noProof/>
+                <w:webHidden/>
+                <w:lang w:val="es-DO"/>
               </w:rPr>
               <w:t>5</w:t>
+            </w:r>
+            <w:r>
+              <w:rPr>
+                <w:noProof/>
+                <w:webHidden/>
+                <w:lang w:val="es-DO"/>
+              </w:rPr>
+              <w:fldChar w:fldCharType="end"/>
             </w:r>
           </w:hyperlink>
         </w:p>
@@ -782,24 +1016,79 @@
           <w:pPr>
             <w:pStyle w:val="TOC1"/>
             <w:tabs>
-              <w:tab w:val="right" w:leader="dot" w:pos="9352"/>
+              <w:tab w:val="right" w:leader="dot" w:pos="9710"/>
             </w:tabs>
+            <w:rPr>
+              <w:rFonts w:asciiTheme="minorHAnsi" w:eastAsiaTheme="minorEastAsia" w:hAnsiTheme="minorHAnsi" w:cstheme="minorBidi"/>
+              <w:noProof/>
+              <w:kern w:val="2"/>
+              <w:lang w:val="es-DO" w:eastAsia="zh-TW"/>
+              <w14:ligatures w14:val="standardContextual"/>
+            </w:rPr>
           </w:pPr>
-          <w:hyperlink w:anchor="_bookmark10" w:history="1">
-            <w:r>
-              <w:rPr>
-                <w:spacing w:val="-2"/>
-              </w:rPr>
-              <w:t>Procedimientos:</w:t>
-            </w:r>
-            <w:r>
+          <w:hyperlink w:anchor="_Toc233489401" w:history="1">
+            <w:r>
+              <w:rPr>
+                <w:rStyle w:val="Hyperlink"/>
+                <w:noProof/>
+                <w:lang w:val="es-DO"/>
+              </w:rPr>
+              <w:t>Procedimiento</w:t>
+            </w:r>
+            <w:r>
+              <w:rPr>
+                <w:noProof/>
+                <w:webHidden/>
+                <w:lang w:val="es-DO"/>
+              </w:rPr>
               <w:tab/>
             </w:r>
             <w:r>
               <w:rPr>
-                <w:spacing w:val="-10"/>
-              </w:rPr>
-              <w:t>8</w:t>
+                <w:noProof/>
+                <w:webHidden/>
+                <w:lang w:val="es-DO"/>
+              </w:rPr>
+              <w:fldChar w:fldCharType="begin"/>
+            </w:r>
+            <w:r>
+              <w:rPr>
+                <w:noProof/>
+                <w:webHidden/>
+                <w:lang w:val="es-DO"/>
+              </w:rPr>
+              <w:instrText xml:space="preserve"> PAGEREF _Toc233489401 \h </w:instrText>
+            </w:r>
+            <w:r>
+              <w:rPr>
+                <w:noProof/>
+                <w:webHidden/>
+                <w:lang w:val="es-DO"/>
+              </w:rPr>
+            </w:r>
+            <w:r>
+              <w:rPr>
+                <w:noProof/>
+                <w:webHidden/>
+                <w:lang w:val="es-DO"/>
+              </w:rPr>
+              <w:fldChar w:fldCharType="separate"/>
+            </w:r>
+            <w:r>
+              <w:rPr>
+                <w:noProof/>
+                <w:webHidden/>
+                <w:lang w:val="es-DO"/>
+              </w:rPr>
+              <w:t>6</w:t>
+            </w:r>
+            <w:r>
+              <w:rPr>
+                <w:noProof/>
+                <w:webHidden/>
+                <w:lang w:val="es-DO"/>
+              </w:rPr>
+              <w:fldChar w:fldCharType="end"/>
             </w:r>
           </w:hyperlink>
         </w:p>
@@ -807,32 +1096,79 @@
           <w:pPr>
             <w:pStyle w:val="TOC1"/>
             <w:tabs>
-              <w:tab w:val="right" w:leader="dot" w:pos="9352"/>
+              <w:tab w:val="right" w:leader="dot" w:pos="9710"/>
             </w:tabs>
+            <w:rPr>
+              <w:rFonts w:asciiTheme="minorHAnsi" w:eastAsiaTheme="minorEastAsia" w:hAnsiTheme="minorHAnsi" w:cstheme="minorBidi"/>
+              <w:noProof/>
+              <w:kern w:val="2"/>
+              <w:lang w:val="es-DO" w:eastAsia="zh-TW"/>
+              <w14:ligatures w14:val="standardContextual"/>
+            </w:rPr>
           </w:pPr>
-          <w:hyperlink w:anchor="_bookmark24" w:history="1">
-            <w:proofErr w:type="spellStart"/>
-            <w:r>
-              <w:rPr>
-                <w:spacing w:val="-2"/>
-              </w:rPr>
-              <w:t>Conclusion</w:t>
-            </w:r>
-            <w:proofErr w:type="spellEnd"/>
-            <w:r>
-              <w:rPr>
-                <w:spacing w:val="-2"/>
-              </w:rPr>
-              <w:t>:</w:t>
-            </w:r>
-            <w:r>
+          <w:hyperlink w:anchor="_Toc233489402" w:history="1">
+            <w:r>
+              <w:rPr>
+                <w:rStyle w:val="Hyperlink"/>
+                <w:noProof/>
+                <w:lang w:val="es-DO"/>
+              </w:rPr>
+              <w:t>Conclusión</w:t>
+            </w:r>
+            <w:r>
+              <w:rPr>
+                <w:noProof/>
+                <w:webHidden/>
+                <w:lang w:val="es-DO"/>
+              </w:rPr>
               <w:tab/>
             </w:r>
             <w:r>
               <w:rPr>
-                <w:spacing w:val="-5"/>
-              </w:rPr>
-              <w:t>18</w:t>
+                <w:noProof/>
+                <w:webHidden/>
+                <w:lang w:val="es-DO"/>
+              </w:rPr>
+              <w:fldChar w:fldCharType="begin"/>
+            </w:r>
+            <w:r>
+              <w:rPr>
+                <w:noProof/>
+                <w:webHidden/>
+                <w:lang w:val="es-DO"/>
+              </w:rPr>
+              <w:instrText xml:space="preserve"> PAGEREF _Toc233489402 \h </w:instrText>
+            </w:r>
+            <w:r>
+              <w:rPr>
+                <w:noProof/>
+                <w:webHidden/>
+                <w:lang w:val="es-DO"/>
+              </w:rPr>
+            </w:r>
+            <w:r>
+              <w:rPr>
+                <w:noProof/>
+                <w:webHidden/>
+                <w:lang w:val="es-DO"/>
+              </w:rPr>
+              <w:fldChar w:fldCharType="separate"/>
+            </w:r>
+            <w:r>
+              <w:rPr>
+                <w:noProof/>
+                <w:webHidden/>
+                <w:lang w:val="es-DO"/>
+              </w:rPr>
+              <w:t>11</w:t>
+            </w:r>
+            <w:r>
+              <w:rPr>
+                <w:noProof/>
+                <w:webHidden/>
+                <w:lang w:val="es-DO"/>
+              </w:rPr>
+              <w:fldChar w:fldCharType="end"/>
             </w:r>
           </w:hyperlink>
         </w:p>
@@ -840,27 +1176,97 @@
           <w:pPr>
             <w:pStyle w:val="TOC1"/>
             <w:tabs>
-              <w:tab w:val="right" w:leader="dot" w:pos="9352"/>
+              <w:tab w:val="right" w:leader="dot" w:pos="9710"/>
             </w:tabs>
-            <w:spacing w:before="98"/>
+            <w:rPr>
+              <w:rFonts w:asciiTheme="minorHAnsi" w:eastAsiaTheme="minorEastAsia" w:hAnsiTheme="minorHAnsi" w:cstheme="minorBidi"/>
+              <w:noProof/>
+              <w:kern w:val="2"/>
+              <w:lang w:val="es-DO" w:eastAsia="zh-TW"/>
+              <w14:ligatures w14:val="standardContextual"/>
+            </w:rPr>
           </w:pPr>
-          <w:hyperlink w:anchor="_bookmark25" w:history="1">
-            <w:r>
-              <w:rPr>
-                <w:spacing w:val="-2"/>
+          <w:hyperlink w:anchor="_Toc233489403" w:history="1">
+            <w:r>
+              <w:rPr>
+                <w:rStyle w:val="Hyperlink"/>
+                <w:noProof/>
+                <w:lang w:val="es-DO"/>
               </w:rPr>
               <w:t>Bibliografía</w:t>
             </w:r>
             <w:r>
+              <w:rPr>
+                <w:noProof/>
+                <w:webHidden/>
+                <w:lang w:val="es-DO"/>
+              </w:rPr>
               <w:tab/>
             </w:r>
             <w:r>
               <w:rPr>
-                <w:spacing w:val="-5"/>
-              </w:rPr>
-              <w:t>18</w:t>
+                <w:noProof/>
+                <w:webHidden/>
+                <w:lang w:val="es-DO"/>
+              </w:rPr>
+              <w:fldChar w:fldCharType="begin"/>
+            </w:r>
+            <w:r>
+              <w:rPr>
+                <w:noProof/>
+                <w:webHidden/>
+                <w:lang w:val="es-DO"/>
+              </w:rPr>
+              <w:instrText xml:space="preserve"> PAGEREF _Toc233489403 \h </w:instrText>
+            </w:r>
+            <w:r>
+              <w:rPr>
+                <w:noProof/>
+                <w:webHidden/>
+                <w:lang w:val="es-DO"/>
+              </w:rPr>
+            </w:r>
+            <w:r>
+              <w:rPr>
+                <w:noProof/>
+                <w:webHidden/>
+                <w:lang w:val="es-DO"/>
+              </w:rPr>
+              <w:fldChar w:fldCharType="separate"/>
+            </w:r>
+            <w:r>
+              <w:rPr>
+                <w:noProof/>
+                <w:webHidden/>
+                <w:lang w:val="es-DO"/>
+              </w:rPr>
+              <w:t>12</w:t>
+            </w:r>
+            <w:r>
+              <w:rPr>
+                <w:noProof/>
+                <w:webHidden/>
+                <w:lang w:val="es-DO"/>
+              </w:rPr>
+              <w:fldChar w:fldCharType="end"/>
             </w:r>
           </w:hyperlink>
+        </w:p>
+        <w:p>
+          <w:pPr>
+            <w:rPr>
+              <w:lang w:val="es-DO"/>
+            </w:rPr>
+          </w:pPr>
+          <w:r>
+            <w:rPr>
+              <w:b/>
+              <w:bCs/>
+              <w:noProof/>
+              <w:lang w:val="es-DO"/>
+            </w:rPr>
+            <w:fldChar w:fldCharType="end"/>
+          </w:r>
         </w:p>
       </w:sdtContent>
     </w:sdt>
@@ -876,259 +1282,1403 @@
     </w:p>
     <w:p>
       <w:pPr>
-        <w:pStyle w:val="BodyText"/>
-        <w:rPr>
-          <w:sz w:val="20"/>
-        </w:rPr>
-      </w:pPr>
-      <w:bookmarkStart w:id="0" w:name="_bookmark0"/>
-      <w:bookmarkEnd w:id="0"/>
-    </w:p>
-    <w:p>
-      <w:pPr>
-        <w:pStyle w:val="BodyText"/>
-        <w:rPr>
-          <w:sz w:val="20"/>
-        </w:rPr>
-      </w:pPr>
-    </w:p>
-    <w:p>
-      <w:pPr>
-        <w:pStyle w:val="BodyText"/>
-        <w:rPr>
-          <w:sz w:val="20"/>
-        </w:rPr>
-      </w:pPr>
-    </w:p>
-    <w:p>
-      <w:pPr>
-        <w:pStyle w:val="BodyText"/>
-        <w:rPr>
-          <w:sz w:val="20"/>
-        </w:rPr>
-      </w:pPr>
-    </w:p>
-    <w:p>
-      <w:pPr>
-        <w:pStyle w:val="BodyText"/>
-        <w:rPr>
-          <w:sz w:val="20"/>
-        </w:rPr>
-      </w:pPr>
-    </w:p>
-    <w:p>
-      <w:pPr>
-        <w:pStyle w:val="BodyText"/>
-        <w:rPr>
-          <w:sz w:val="20"/>
-        </w:rPr>
-      </w:pPr>
-    </w:p>
-    <w:p>
-      <w:pPr>
-        <w:pStyle w:val="BodyText"/>
-        <w:rPr>
-          <w:sz w:val="20"/>
-        </w:rPr>
-      </w:pPr>
-    </w:p>
-    <w:p>
-      <w:pPr>
-        <w:pStyle w:val="BodyText"/>
-        <w:rPr>
-          <w:sz w:val="20"/>
-        </w:rPr>
-      </w:pPr>
-    </w:p>
-    <w:p>
-      <w:pPr>
-        <w:pStyle w:val="BodyText"/>
-        <w:rPr>
-          <w:sz w:val="20"/>
-        </w:rPr>
-      </w:pPr>
-    </w:p>
-    <w:p>
-      <w:pPr>
-        <w:pStyle w:val="BodyText"/>
-        <w:rPr>
-          <w:sz w:val="20"/>
-        </w:rPr>
-      </w:pPr>
-    </w:p>
-    <w:p>
-      <w:pPr>
-        <w:pStyle w:val="BodyText"/>
-        <w:rPr>
-          <w:sz w:val="20"/>
-        </w:rPr>
-      </w:pPr>
-    </w:p>
-    <w:p>
-      <w:pPr>
-        <w:pStyle w:val="BodyText"/>
-        <w:rPr>
-          <w:sz w:val="20"/>
-        </w:rPr>
-      </w:pPr>
-    </w:p>
-    <w:p>
-      <w:pPr>
-        <w:pStyle w:val="BodyText"/>
-        <w:rPr>
-          <w:sz w:val="20"/>
-        </w:rPr>
-      </w:pPr>
-    </w:p>
-    <w:p>
-      <w:pPr>
-        <w:pStyle w:val="BodyText"/>
-        <w:rPr>
-          <w:sz w:val="20"/>
-        </w:rPr>
-      </w:pPr>
-    </w:p>
-    <w:p>
-      <w:pPr>
-        <w:pStyle w:val="BodyText"/>
-        <w:rPr>
-          <w:sz w:val="20"/>
-        </w:rPr>
-      </w:pPr>
-    </w:p>
-    <w:p>
-      <w:pPr>
-        <w:pStyle w:val="BodyText"/>
-        <w:rPr>
-          <w:sz w:val="20"/>
-        </w:rPr>
-      </w:pPr>
-    </w:p>
-    <w:p>
-      <w:pPr>
-        <w:pStyle w:val="BodyText"/>
-        <w:rPr>
-          <w:sz w:val="20"/>
-        </w:rPr>
-      </w:pPr>
-    </w:p>
-    <w:p>
-      <w:pPr>
-        <w:pStyle w:val="BodyText"/>
-        <w:rPr>
-          <w:sz w:val="20"/>
-        </w:rPr>
-      </w:pPr>
-    </w:p>
-    <w:p>
-      <w:pPr>
-        <w:pStyle w:val="BodyText"/>
-        <w:rPr>
-          <w:sz w:val="20"/>
-        </w:rPr>
-      </w:pPr>
-    </w:p>
-    <w:p>
-      <w:pPr>
-        <w:pStyle w:val="BodyText"/>
-        <w:rPr>
-          <w:sz w:val="20"/>
-        </w:rPr>
-      </w:pPr>
-    </w:p>
-    <w:p>
-      <w:pPr>
-        <w:pStyle w:val="BodyText"/>
-        <w:rPr>
-          <w:sz w:val="20"/>
-        </w:rPr>
-      </w:pPr>
-    </w:p>
-    <w:p>
-      <w:pPr>
-        <w:pStyle w:val="BodyText"/>
-        <w:rPr>
-          <w:sz w:val="20"/>
-        </w:rPr>
-      </w:pPr>
-    </w:p>
-    <w:p>
-      <w:pPr>
-        <w:pStyle w:val="BodyText"/>
-        <w:rPr>
-          <w:sz w:val="20"/>
-        </w:rPr>
-      </w:pPr>
-    </w:p>
-    <w:p>
-      <w:pPr>
-        <w:pStyle w:val="BodyText"/>
-        <w:rPr>
-          <w:sz w:val="20"/>
-        </w:rPr>
-      </w:pPr>
-    </w:p>
-    <w:p>
-      <w:pPr>
-        <w:pStyle w:val="BodyText"/>
-        <w:rPr>
-          <w:sz w:val="20"/>
-        </w:rPr>
-      </w:pPr>
-    </w:p>
-    <w:p>
-      <w:pPr>
-        <w:pStyle w:val="BodyText"/>
-        <w:rPr>
-          <w:sz w:val="20"/>
-        </w:rPr>
-      </w:pPr>
-    </w:p>
-    <w:p>
-      <w:pPr>
-        <w:pStyle w:val="BodyText"/>
-        <w:rPr>
-          <w:sz w:val="20"/>
-        </w:rPr>
-      </w:pPr>
-    </w:p>
-    <w:p>
-      <w:pPr>
-        <w:pStyle w:val="BodyText"/>
-        <w:rPr>
-          <w:sz w:val="20"/>
-        </w:rPr>
-      </w:pPr>
-    </w:p>
-    <w:p>
-      <w:pPr>
-        <w:pStyle w:val="BodyText"/>
-        <w:rPr>
-          <w:sz w:val="20"/>
-        </w:rPr>
-      </w:pPr>
-    </w:p>
-    <w:p>
-      <w:pPr>
-        <w:pStyle w:val="BodyText"/>
-        <w:rPr>
-          <w:sz w:val="20"/>
-        </w:rPr>
-      </w:pPr>
-    </w:p>
-    <w:p>
-      <w:pPr>
-        <w:pStyle w:val="BodyText"/>
-        <w:rPr>
-          <w:sz w:val="20"/>
-        </w:rPr>
-      </w:pPr>
-    </w:p>
-    <w:p>
-      <w:pPr>
-        <w:pStyle w:val="BodyText"/>
-        <w:rPr>
-          <w:sz w:val="20"/>
+        <w:pStyle w:val="Heading1"/>
+      </w:pPr>
+      <w:bookmarkStart w:id="10" w:name="_Toc233489398"/>
+      <w:r>
+        <w:lastRenderedPageBreak/>
+        <w:t>Introducción</w:t>
+      </w:r>
+      <w:bookmarkEnd w:id="10"/>
+    </w:p>
+    <w:p>
+      <w:pPr>
+        <w:pStyle w:val="TOC1"/>
+        <w:jc w:val="both"/>
+      </w:pPr>
+      <w:r>
+        <w:t>El lenguaje “</w:t>
+      </w:r>
+      <w:proofErr w:type="spellStart"/>
+      <w:r>
+        <w:t>Assembly</w:t>
+      </w:r>
+      <w:proofErr w:type="spellEnd"/>
+      <w:r>
+        <w:t xml:space="preserve">” como tal, tuvo sus inicios en la década de los ’40 (1940), fue cuando surgió su primera generación, </w:t>
+      </w:r>
+      <w:proofErr w:type="spellStart"/>
+      <w:r>
+        <w:t>Assembly</w:t>
+      </w:r>
+      <w:proofErr w:type="spellEnd"/>
+      <w:r>
+        <w:t xml:space="preserve"> permitió el uso de código legible, utilizando código mnemónico, En la década de los ’50, surgió su segunda generación, junto a lenguajes de alto nivel como FORTRAN y COBOL, </w:t>
+      </w:r>
+      <w:proofErr w:type="spellStart"/>
+      <w:r>
+        <w:t>Assembly</w:t>
+      </w:r>
+      <w:proofErr w:type="spellEnd"/>
+      <w:r>
+        <w:t xml:space="preserve"> </w:t>
+      </w:r>
+      <w:r>
+        <w:t xml:space="preserve">se volvió más intrinco </w:t>
+      </w:r>
+      <w:r>
+        <w:t>con el propósito de manejar instrucciones complejas para equipos especializados.</w:t>
+      </w:r>
+      <w:r>
+        <w:t xml:space="preserve"> </w:t>
+      </w:r>
+      <w:r>
+        <w:t xml:space="preserve">Para las futuras generaciones, se volvió un standard en circuitos integrados, resultando en computadores potentes, e integrando en su lenguaje las macros y etiquetas simbólicas, esto mejoro la forma de leer el código y la productividad del desarrollador. En la cuarta generación, el desarrollo de microprocesadores dio paso a la creación de las PC y el Apple II, se rediseño el lenguaje para mejorar el manejo de este para el usuario, integrando </w:t>
+      </w:r>
+      <w:r>
+        <w:t>hendidura</w:t>
+      </w:r>
+      <w:r>
+        <w:t xml:space="preserve"> automática</w:t>
+      </w:r>
+      <w:r>
+        <w:t xml:space="preserve"> y resaltado de sintaxis, esto mejoro la productividad de los programadores y permitió una mejor enseñanza del lenguaje.</w:t>
+      </w:r>
+      <w:r>
+        <w:t xml:space="preserve"> En el presente, </w:t>
+      </w:r>
+      <w:proofErr w:type="spellStart"/>
+      <w:r>
+        <w:t>Assembly</w:t>
+      </w:r>
+      <w:proofErr w:type="spellEnd"/>
+      <w:r>
+        <w:t xml:space="preserve"> permite la programación de múltiples procesos computacionales, a esta técnica se le llama “sistema de proceso paralelo”, esto nos demuestra que </w:t>
+      </w:r>
+      <w:proofErr w:type="spellStart"/>
+      <w:r>
+        <w:t>Assembly</w:t>
+      </w:r>
+      <w:proofErr w:type="spellEnd"/>
+      <w:r>
+        <w:t xml:space="preserve"> se sigue empleando y desarrollando para un mejor desempeño en la computación actual.</w:t>
+      </w:r>
+    </w:p>
+    <w:p>
+      <w:pPr>
+        <w:pStyle w:val="TOC1"/>
+        <w:jc w:val="both"/>
+      </w:pPr>
+      <w:proofErr w:type="spellStart"/>
+      <w:r>
+        <w:t>Assembly</w:t>
+      </w:r>
+      <w:proofErr w:type="spellEnd"/>
+      <w:r>
+        <w:t xml:space="preserve"> fue hecho para que el programador se comunique directamente con el hardware, utilizando registros, ubicación de memoria, y dispositivos de entrada y salida, aunque este pueda permitir comunicarse con cualquier tipo de hardware, mientras el programador sepa la programación de</w:t>
+      </w:r>
+      <w:r>
+        <w:t>l dispositivo en cuestión.</w:t>
+      </w:r>
+    </w:p>
+    <w:p>
+      <w:pPr>
+        <w:rPr>
+          <w:sz w:val="24"/>
+          <w:szCs w:val="24"/>
+        </w:rPr>
+      </w:pPr>
+      <w:r>
+        <w:br w:type="page"/>
+      </w:r>
+    </w:p>
+    <w:p>
+      <w:pPr>
+        <w:pStyle w:val="TOC1"/>
+        <w:jc w:val="both"/>
+      </w:pPr>
+    </w:p>
+    <w:p>
+      <w:pPr>
+        <w:pStyle w:val="Heading1"/>
+      </w:pPr>
+      <w:bookmarkStart w:id="11" w:name="_Toc233489399"/>
+      <w:r>
+        <w:t>Objetivos</w:t>
+      </w:r>
+      <w:bookmarkEnd w:id="11"/>
+    </w:p>
+    <w:p>
+      <w:pPr>
+        <w:pStyle w:val="TOC1"/>
+        <w:jc w:val="both"/>
+      </w:pPr>
+      <w:r>
+        <w:t>Este trabajo se hizo con el propósito de entender ensamblador y como se modifican los datos en los registros utilizando un lenguaje de bajo nive</w:t>
+      </w:r>
+      <w:r>
+        <w:t>l</w:t>
+      </w:r>
+      <w:r>
+        <w:t xml:space="preserve">. </w:t>
+      </w:r>
+      <w:r>
+        <w:t>También</w:t>
+      </w:r>
+      <w:r>
+        <w:t xml:space="preserve">, se busca comprender la implementación de estructuras de control, como son las condicionales y bucles, el uso de </w:t>
+      </w:r>
+      <w:proofErr w:type="spellStart"/>
+      <w:r>
+        <w:t>syscalls</w:t>
+      </w:r>
+      <w:proofErr w:type="spellEnd"/>
+      <w:r>
+        <w:t xml:space="preserve"> para la entrada y salida en la terminal/consola, y lograr desarrollar algoritmos más complejos en ensamblador.</w:t>
+      </w:r>
+    </w:p>
+    <w:p>
+      <w:pPr>
+        <w:pStyle w:val="TOC1"/>
+        <w:jc w:val="both"/>
+      </w:pPr>
+      <w:r>
+        <w:t xml:space="preserve">Toca tomar en cuenta, que mi trabajo fue orientado para maquinas Linux, y por situaciones en el desarrollo opte por crear una librería para las funciones requeridas. En el documento, especifica instalar Visual Studio, con el </w:t>
+      </w:r>
+      <w:proofErr w:type="spellStart"/>
+      <w:r>
+        <w:t>workload</w:t>
+      </w:r>
+      <w:proofErr w:type="spellEnd"/>
+      <w:r>
+        <w:t xml:space="preserve"> “Desarrollo en C++ para escritorio de Windows”, y </w:t>
+      </w:r>
+      <w:r>
+        <w:t>verificar</w:t>
+      </w:r>
+      <w:r>
+        <w:t xml:space="preserve"> que el ensamblador MASM este habilitado. En mi caso, ya que tengo mi maquina modificada y optimizada a mi personalidad, he optado por utilizar Linux. Mas adelante explicare el método de trabajo y como logre crear mi programa.</w:t>
+      </w:r>
+    </w:p>
+    <w:p>
+      <w:pPr>
+        <w:jc w:val="both"/>
+      </w:pPr>
+    </w:p>
+    <w:p>
+      <w:r>
+        <w:br w:type="page"/>
+      </w:r>
+    </w:p>
+    <w:p>
+      <w:pPr>
+        <w:pStyle w:val="Heading1"/>
+      </w:pPr>
+      <w:bookmarkStart w:id="12" w:name="_Toc233489400"/>
+      <w:r>
+        <w:lastRenderedPageBreak/>
+        <w:t xml:space="preserve">Marco </w:t>
+      </w:r>
+      <w:r>
+        <w:t>Teórico</w:t>
+      </w:r>
+      <w:bookmarkEnd w:id="12"/>
+    </w:p>
+    <w:p>
+      <w:pPr>
+        <w:pStyle w:val="TOC1"/>
+        <w:jc w:val="both"/>
+      </w:pPr>
+      <w:r>
+        <w:t xml:space="preserve">Explicando con mejor claridad, el proceso que lleve a cabo para el desarrollo de mi laboratorio fue manualmente crear las funciones, ya que, al no poder hacer la instalación por falta de memoria, opte por crear mis propias funciones. Guiándome de la consigna, y con ayuda de Inteligencia Artificial, recree las funciones principales, como la impresión en la consola y la entrada de datos de parte del usuario en esta misma (la consola). </w:t>
+      </w:r>
+    </w:p>
+    <w:p>
+      <w:pPr>
+        <w:pStyle w:val="TOC1"/>
+        <w:jc w:val="both"/>
+      </w:pPr>
+      <w:r>
+        <w:t xml:space="preserve">Para empezar, lo primero que hice fue iniciar sesión en mi subsistema de Linux, (En mi caso utilizo Kali Linux), e instale un ensamblador. Un ensamblador es el “compilador” que traduce el código de </w:t>
+      </w:r>
+      <w:proofErr w:type="spellStart"/>
+      <w:r>
+        <w:t>Assembly</w:t>
+      </w:r>
+      <w:proofErr w:type="spellEnd"/>
+      <w:r>
+        <w:t xml:space="preserve"> en código maquina ejecutable para el procesador.</w:t>
+      </w:r>
+      <w:r>
+        <w:t xml:space="preserve"> Un ensamblador es un programa que convierte las instrucciones escritas en “</w:t>
+      </w:r>
+      <w:proofErr w:type="spellStart"/>
+      <w:r>
+        <w:t>Assembly</w:t>
+      </w:r>
+      <w:proofErr w:type="spellEnd"/>
+      <w:r>
+        <w:t>”, en lenguaje máquina</w:t>
+      </w:r>
+      <w:r>
+        <w:t xml:space="preserve">. En mi caso, opte por usar NASM, para </w:t>
+      </w:r>
+      <w:r>
+        <w:t>U</w:t>
+      </w:r>
+      <w:r>
+        <w:t>nix.</w:t>
+      </w:r>
+      <w:r>
+        <w:t xml:space="preserve"> NASM (</w:t>
+      </w:r>
+      <w:proofErr w:type="spellStart"/>
+      <w:r>
+        <w:t>Netwide</w:t>
+      </w:r>
+      <w:proofErr w:type="spellEnd"/>
+      <w:r>
+        <w:t xml:space="preserve"> </w:t>
+      </w:r>
+      <w:proofErr w:type="spellStart"/>
+      <w:r>
+        <w:t>Assembler</w:t>
+      </w:r>
+      <w:proofErr w:type="spellEnd"/>
+      <w:r>
+        <w:t>), diseñado para Intel x86, permite a los programadores crear programas de 16, 32 y 64 bit, es utilizado en Linux y en chips x86, y es open-</w:t>
+      </w:r>
+      <w:proofErr w:type="spellStart"/>
+      <w:r>
+        <w:t>source</w:t>
+      </w:r>
+      <w:proofErr w:type="spellEnd"/>
+      <w:r>
+        <w:t>.</w:t>
+      </w:r>
+      <w:r>
+        <w:t xml:space="preserve"> Para el desarrollo de las funciones</w:t>
+      </w:r>
+      <w:r>
+        <w:t>, lo que hice fue un archivo `linux64io.inc` el cual incluye todas las funciones, para imprimir y recibir datos en la consola/terminal.</w:t>
+      </w:r>
+    </w:p>
+    <w:p>
+      <w:pPr>
+        <w:rPr>
+          <w:sz w:val="24"/>
+          <w:szCs w:val="24"/>
+        </w:rPr>
+      </w:pPr>
+      <w:r>
+        <w:br w:type="page"/>
+      </w:r>
+    </w:p>
+    <w:p>
+      <w:pPr>
+        <w:pStyle w:val="Heading1"/>
+      </w:pPr>
+      <w:bookmarkStart w:id="13" w:name="_Toc233489401"/>
+      <w:r>
+        <w:lastRenderedPageBreak/>
+        <w:t>Procedimiento</w:t>
+      </w:r>
+      <w:bookmarkEnd w:id="13"/>
+    </w:p>
+    <w:p>
+      <w:pPr>
+        <w:pStyle w:val="TOC1"/>
+        <w:jc w:val="both"/>
+      </w:pPr>
+      <w:r>
+        <w:t xml:space="preserve">Lo primero que hice, fue hacer el archivo `linux64io.inc`, el cual incluye todas las funciones para la entrada y salida de datos, como </w:t>
+      </w:r>
+      <w:proofErr w:type="spellStart"/>
+      <w:r>
+        <w:t>print_int</w:t>
+      </w:r>
+      <w:proofErr w:type="spellEnd"/>
+      <w:r>
+        <w:t xml:space="preserve">, </w:t>
+      </w:r>
+      <w:proofErr w:type="spellStart"/>
+      <w:r>
+        <w:t>read_int</w:t>
+      </w:r>
+      <w:proofErr w:type="spellEnd"/>
+      <w:r>
+        <w:t xml:space="preserve">. El primero da como salida un numero en la consola, y el segundo permite la entrada de un numero entero del usuario en la consola. Si requieren revisar la librería, en </w:t>
+      </w:r>
+      <w:r>
+        <w:t>GitHub</w:t>
+      </w:r>
+      <w:r>
+        <w:t xml:space="preserve"> se puede encontrar. (Referencia bibliográfica).</w:t>
+      </w:r>
+      <w:r>
+        <w:t xml:space="preserve"> Para incluir la librería, solo debemos copiar y pegar el archivo `*.</w:t>
+      </w:r>
+      <w:proofErr w:type="spellStart"/>
+      <w:r>
+        <w:t>inc</w:t>
+      </w:r>
+      <w:proofErr w:type="spellEnd"/>
+      <w:r>
+        <w:t>` en el directorio del proyecto</w:t>
+      </w:r>
+      <w:r>
+        <w:t xml:space="preserve">, y luego invocarlo con la siguiente </w:t>
+      </w:r>
+      <w:proofErr w:type="spellStart"/>
+      <w:r>
+        <w:t>linea</w:t>
+      </w:r>
+      <w:proofErr w:type="spellEnd"/>
+      <w:r>
+        <w:t xml:space="preserve"> de código: `%</w:t>
+      </w:r>
+      <w:proofErr w:type="spellStart"/>
+      <w:r>
+        <w:t>include</w:t>
+      </w:r>
+      <w:proofErr w:type="spellEnd"/>
+      <w:r>
+        <w:t xml:space="preserve"> “linux64io.inc`.</w:t>
+      </w:r>
+    </w:p>
+    <w:p>
+      <w:pPr>
+        <w:pStyle w:val="TOC1"/>
+        <w:jc w:val="both"/>
+      </w:pPr>
+      <w:r>
+        <w:t>Luego de preparar una librería para mejorar el desarrollo del laboratorio, me puse a hacer el código de `SumaNum.asm` para confirmar que la librería funcionara.</w:t>
+      </w:r>
+    </w:p>
+    <w:p>
+      <w:pPr>
+        <w:pStyle w:val="TOC1"/>
+        <w:jc w:val="both"/>
+      </w:pPr>
+      <w:r>
+        <w:drawing>
+          <wp:inline distT="0" distB="0" distL="0" distR="0" wp14:anchorId="1559A02B" wp14:editId="5A0360A7">
+            <wp:extent cx="5753100" cy="6613291"/>
+            <wp:effectExtent l="0" t="0" r="0" b="0"/>
+            <wp:docPr id="89599146" name="Picture 1"/>
+            <wp:cNvGraphicFramePr>
+              <a:graphicFrameLocks xmlns:a="http://schemas.openxmlformats.org/drawingml/2006/main" noChangeAspect="1"/>
+            </wp:cNvGraphicFramePr>
+            <a:graphic xmlns:a="http://schemas.openxmlformats.org/drawingml/2006/main">
+              <a:graphicData uri="http://schemas.openxmlformats.org/drawingml/2006/picture">
+                <pic:pic xmlns:pic="http://schemas.openxmlformats.org/drawingml/2006/picture">
+                  <pic:nvPicPr>
+                    <pic:cNvPr id="89599146" name=""/>
+                    <pic:cNvPicPr/>
+                  </pic:nvPicPr>
+                  <pic:blipFill>
+                    <a:blip r:embed="rId7"/>
+                    <a:stretch>
+                      <a:fillRect/>
+                    </a:stretch>
+                  </pic:blipFill>
+                  <pic:spPr>
+                    <a:xfrm>
+                      <a:off x="0" y="0"/>
+                      <a:ext cx="5755777" cy="6616368"/>
+                    </a:xfrm>
+                    <a:prstGeom prst="rect">
+                      <a:avLst/>
+                    </a:prstGeom>
+                  </pic:spPr>
+                </pic:pic>
+              </a:graphicData>
+            </a:graphic>
+          </wp:inline>
+        </w:drawing>
+      </w:r>
+    </w:p>
+    <w:p>
+      <w:pPr>
+        <w:pStyle w:val="TOC1"/>
+        <w:jc w:val="both"/>
+      </w:pPr>
+      <w:r>
+        <w:t>En la imagen se muestra el código del ejercicio de suma de valores, utilizando las funciones creadas.</w:t>
+      </w:r>
+    </w:p>
+    <w:p>
+      <w:pPr>
+        <w:pStyle w:val="TOC1"/>
+        <w:jc w:val="both"/>
+      </w:pPr>
+      <w:r>
+        <w:lastRenderedPageBreak/>
+        <w:t>Con `</w:t>
+      </w:r>
+      <w:proofErr w:type="spellStart"/>
+      <w:r>
+        <w:t>add</w:t>
+      </w:r>
+      <w:proofErr w:type="spellEnd"/>
+      <w:r>
+        <w:t xml:space="preserve"> r12, r13` sumamos los valores, el cual se almacenan en el registro `r12` y luego imprimimos este registro.</w:t>
+      </w:r>
+    </w:p>
+    <w:p>
+      <w:pPr>
+        <w:pStyle w:val="TOC1"/>
+        <w:jc w:val="both"/>
+      </w:pPr>
+      <w:r>
+        <w:t>Compilamos el código utilizando el ensamblador `</w:t>
+      </w:r>
+      <w:proofErr w:type="spellStart"/>
+      <w:r>
+        <w:t>nasm</w:t>
+      </w:r>
+      <w:proofErr w:type="spellEnd"/>
+      <w:r>
+        <w:t>` con el siguiente comando:</w:t>
+      </w:r>
+    </w:p>
+    <w:p>
+      <w:pPr>
+        <w:pStyle w:val="TOC1"/>
+        <w:ind w:firstLine="720"/>
+        <w:jc w:val="both"/>
+      </w:pPr>
+      <w:proofErr w:type="spellStart"/>
+      <w:r>
+        <w:t>nasm</w:t>
+      </w:r>
+      <w:proofErr w:type="spellEnd"/>
+      <w:r>
+        <w:t xml:space="preserve"> -f elf64 SumaNum.asm -o </w:t>
+      </w:r>
+      <w:proofErr w:type="spellStart"/>
+      <w:r>
+        <w:t>SumaNum.o</w:t>
+      </w:r>
+      <w:proofErr w:type="spellEnd"/>
+      <w:r>
+        <w:t xml:space="preserve"> &amp;&amp; </w:t>
+      </w:r>
+      <w:proofErr w:type="spellStart"/>
+      <w:r>
+        <w:t>ld</w:t>
+      </w:r>
+      <w:proofErr w:type="spellEnd"/>
+      <w:r>
+        <w:t xml:space="preserve"> </w:t>
+      </w:r>
+      <w:proofErr w:type="spellStart"/>
+      <w:r>
+        <w:t>SumaNum.o</w:t>
+      </w:r>
+      <w:proofErr w:type="spellEnd"/>
+      <w:r>
+        <w:t xml:space="preserve"> -o </w:t>
+      </w:r>
+      <w:proofErr w:type="spellStart"/>
+      <w:r>
+        <w:t>SumaNum</w:t>
+      </w:r>
+      <w:proofErr w:type="spellEnd"/>
+    </w:p>
+    <w:p>
+      <w:pPr>
+        <w:pStyle w:val="TOC1"/>
+        <w:jc w:val="both"/>
+      </w:pPr>
+      <w:r>
+        <w:t xml:space="preserve">Luego, vamos a correrlo. </w:t>
+      </w:r>
+      <w:r>
+        <w:t>He de recordar</w:t>
+      </w:r>
+      <w:r>
+        <w:t xml:space="preserve"> que todo esto ocurre en el sistema de Linux, específicamente en Kali-Linux.</w:t>
+      </w:r>
+    </w:p>
+    <w:p>
+      <w:pPr>
+        <w:pStyle w:val="TOC1"/>
+        <w:jc w:val="both"/>
+      </w:pPr>
+      <w:r>
+        <w:drawing>
+          <wp:inline distT="0" distB="0" distL="0" distR="0" wp14:anchorId="3178D0A4" wp14:editId="2BF2218C">
+            <wp:extent cx="6172200" cy="647700"/>
+            <wp:effectExtent l="0" t="0" r="0" b="0"/>
+            <wp:docPr id="2003023030" name="Picture 1"/>
+            <wp:cNvGraphicFramePr>
+              <a:graphicFrameLocks xmlns:a="http://schemas.openxmlformats.org/drawingml/2006/main" noChangeAspect="1"/>
+            </wp:cNvGraphicFramePr>
+            <a:graphic xmlns:a="http://schemas.openxmlformats.org/drawingml/2006/main">
+              <a:graphicData uri="http://schemas.openxmlformats.org/drawingml/2006/picture">
+                <pic:pic xmlns:pic="http://schemas.openxmlformats.org/drawingml/2006/picture">
+                  <pic:nvPicPr>
+                    <pic:cNvPr id="2003023030" name=""/>
+                    <pic:cNvPicPr/>
+                  </pic:nvPicPr>
+                  <pic:blipFill>
+                    <a:blip r:embed="rId8"/>
+                    <a:stretch>
+                      <a:fillRect/>
+                    </a:stretch>
+                  </pic:blipFill>
+                  <pic:spPr>
+                    <a:xfrm>
+                      <a:off x="0" y="0"/>
+                      <a:ext cx="6172200" cy="647700"/>
+                    </a:xfrm>
+                    <a:prstGeom prst="rect">
+                      <a:avLst/>
+                    </a:prstGeom>
+                  </pic:spPr>
+                </pic:pic>
+              </a:graphicData>
+            </a:graphic>
+          </wp:inline>
+        </w:drawing>
+      </w:r>
+    </w:p>
+    <w:p>
+      <w:pPr>
+        <w:pStyle w:val="TOC1"/>
+        <w:jc w:val="both"/>
+      </w:pPr>
+      <w:r>
+        <w:t>En la foto, se muestra la suma de dos valores (5 + 43), que el total viene siendo 48.</w:t>
+      </w:r>
+    </w:p>
+    <w:p>
+      <w:pPr>
+        <w:pStyle w:val="TOC1"/>
+        <w:jc w:val="both"/>
+      </w:pPr>
+      <w:r>
+        <w:t>Luego, de comprobar que la librería y el compilador funciona, empezamos a trabajar en las otras dos tareas, factorial y lo de verificar si un numero es un numero primo.</w:t>
+      </w:r>
+    </w:p>
+    <w:p>
+      <w:pPr>
+        <w:pStyle w:val="TOC1"/>
+        <w:jc w:val="both"/>
+        <w:rPr>
+          <w:b/>
+          <w:bCs/>
+        </w:rPr>
+      </w:pPr>
+      <w:r>
+        <w:rPr>
+          <w:b/>
+          <w:bCs/>
+        </w:rPr>
+        <w:t>Factorial</w:t>
+      </w:r>
+    </w:p>
+    <w:p>
+      <w:pPr>
+        <w:pStyle w:val="TOC1"/>
+        <w:jc w:val="both"/>
+      </w:pPr>
+      <w:r>
+        <w:drawing>
+          <wp:inline distT="0" distB="0" distL="0" distR="0" wp14:anchorId="367026AB" wp14:editId="010B4227">
+            <wp:extent cx="3371850" cy="5851525"/>
+            <wp:effectExtent l="0" t="0" r="0" b="0"/>
+            <wp:docPr id="1622099000" name="Picture 1"/>
+            <wp:cNvGraphicFramePr>
+              <a:graphicFrameLocks xmlns:a="http://schemas.openxmlformats.org/drawingml/2006/main" noChangeAspect="1"/>
+            </wp:cNvGraphicFramePr>
+            <a:graphic xmlns:a="http://schemas.openxmlformats.org/drawingml/2006/main">
+              <a:graphicData uri="http://schemas.openxmlformats.org/drawingml/2006/picture">
+                <pic:pic xmlns:pic="http://schemas.openxmlformats.org/drawingml/2006/picture">
+                  <pic:nvPicPr>
+                    <pic:cNvPr id="1622099000" name=""/>
+                    <pic:cNvPicPr/>
+                  </pic:nvPicPr>
+                  <pic:blipFill>
+                    <a:blip r:embed="rId9"/>
+                    <a:stretch>
+                      <a:fillRect/>
+                    </a:stretch>
+                  </pic:blipFill>
+                  <pic:spPr>
+                    <a:xfrm>
+                      <a:off x="0" y="0"/>
+                      <a:ext cx="3371893" cy="5851600"/>
+                    </a:xfrm>
+                    <a:prstGeom prst="rect">
+                      <a:avLst/>
+                    </a:prstGeom>
+                  </pic:spPr>
+                </pic:pic>
+              </a:graphicData>
+            </a:graphic>
+          </wp:inline>
+        </w:drawing>
+      </w:r>
+    </w:p>
+    <w:p>
+      <w:pPr>
+        <w:pStyle w:val="TOC1"/>
+        <w:jc w:val="both"/>
+      </w:pPr>
+      <w:r>
+        <w:lastRenderedPageBreak/>
+        <w:t xml:space="preserve">En factorial, utilizamos un </w:t>
+      </w:r>
+      <w:proofErr w:type="spellStart"/>
+      <w:r>
+        <w:t>loop</w:t>
+      </w:r>
+      <w:proofErr w:type="spellEnd"/>
+      <w:r>
+        <w:t>; como sabemos, para la factorial debemos reducir el valor, ejemplo, si es la factorial de 5, debemos multiplicar 5 * 4 * 3 * … * 1, pero para eso, debemos reducir el valor de la variable y luego multiplicarla.</w:t>
+      </w:r>
+      <w:r>
+        <w:t xml:space="preserve"> Para eso, verificamos si el contador es menor o igual a 1, con `</w:t>
+      </w:r>
+      <w:proofErr w:type="spellStart"/>
+      <w:r>
+        <w:t>cmp</w:t>
+      </w:r>
+      <w:proofErr w:type="spellEnd"/>
+      <w:r>
+        <w:t xml:space="preserve"> </w:t>
+      </w:r>
+      <w:proofErr w:type="spellStart"/>
+      <w:r>
+        <w:t>rcx</w:t>
+      </w:r>
+      <w:proofErr w:type="spellEnd"/>
+      <w:r>
+        <w:t>, 1`, este compara si el valor del registro `</w:t>
+      </w:r>
+      <w:proofErr w:type="spellStart"/>
+      <w:r>
+        <w:t>rcx</w:t>
+      </w:r>
+      <w:proofErr w:type="spellEnd"/>
+      <w:r>
+        <w:t xml:space="preserve">` es igual a 1 o menor, si es el caso, </w:t>
+      </w:r>
+      <w:r>
+        <w:t>esta manda</w:t>
+      </w:r>
+      <w:r>
+        <w:t xml:space="preserve"> una bandera el cual `</w:t>
+      </w:r>
+      <w:proofErr w:type="spellStart"/>
+      <w:r>
+        <w:t>jle</w:t>
+      </w:r>
+      <w:proofErr w:type="spellEnd"/>
+      <w:r>
+        <w:t xml:space="preserve">` verifica, y si es el caso de que es menor o igual a 1, corre la función </w:t>
+      </w:r>
+      <w:proofErr w:type="gramStart"/>
+      <w:r>
+        <w:t>`.done</w:t>
+      </w:r>
+      <w:proofErr w:type="gramEnd"/>
+      <w:r>
+        <w:t>`, la cual imprime los datos al usuario en la terminal.</w:t>
+      </w:r>
+    </w:p>
+    <w:p>
+      <w:pPr>
+        <w:pStyle w:val="TOC1"/>
+        <w:jc w:val="both"/>
+      </w:pPr>
+      <w:r>
+        <w:t>Al compilar, utilizando el mismo comando `</w:t>
+      </w:r>
+      <w:proofErr w:type="spellStart"/>
+      <w:r>
+        <w:t>nasm</w:t>
+      </w:r>
+      <w:proofErr w:type="spellEnd"/>
+      <w:r>
+        <w:t>`, cambiando los nombres de los archivos:</w:t>
+      </w:r>
+    </w:p>
+    <w:p>
+      <w:pPr>
+        <w:pStyle w:val="TOC1"/>
+        <w:jc w:val="both"/>
+      </w:pPr>
+      <w:r>
+        <w:tab/>
+      </w:r>
+      <w:r>
+        <w:t>(</w:t>
+      </w:r>
+      <w:proofErr w:type="spellStart"/>
+      <w:r>
+        <w:t>nasm</w:t>
+      </w:r>
+      <w:proofErr w:type="spellEnd"/>
+      <w:r>
+        <w:t xml:space="preserve"> -f elf64 Factorial.asm -o </w:t>
+      </w:r>
+      <w:proofErr w:type="spellStart"/>
+      <w:r>
+        <w:t>Factorial.o</w:t>
+      </w:r>
+      <w:proofErr w:type="spellEnd"/>
+      <w:r>
+        <w:t xml:space="preserve"> &amp;&amp; </w:t>
+      </w:r>
+      <w:proofErr w:type="spellStart"/>
+      <w:r>
+        <w:t>ld</w:t>
+      </w:r>
+      <w:proofErr w:type="spellEnd"/>
+      <w:r>
+        <w:t xml:space="preserve"> </w:t>
+      </w:r>
+      <w:proofErr w:type="spellStart"/>
+      <w:r>
+        <w:t>Factorial.o</w:t>
+      </w:r>
+      <w:proofErr w:type="spellEnd"/>
+      <w:r>
+        <w:t xml:space="preserve"> -o Factorial) &amp;</w:t>
+      </w:r>
+      <w:proofErr w:type="gramStart"/>
+      <w:r>
+        <w:t>&amp; .</w:t>
+      </w:r>
+      <w:proofErr w:type="gramEnd"/>
+      <w:r>
+        <w:t>/Factorial</w:t>
+      </w:r>
+    </w:p>
+    <w:p>
+      <w:pPr>
+        <w:pStyle w:val="TOC1"/>
+        <w:jc w:val="both"/>
+      </w:pPr>
+      <w:r>
+        <w:drawing>
+          <wp:inline distT="0" distB="0" distL="0" distR="0" wp14:anchorId="57F06497" wp14:editId="518732DE">
+            <wp:extent cx="6172200" cy="690245"/>
+            <wp:effectExtent l="0" t="0" r="0" b="0"/>
+            <wp:docPr id="1566435807" name="Picture 1"/>
+            <wp:cNvGraphicFramePr>
+              <a:graphicFrameLocks xmlns:a="http://schemas.openxmlformats.org/drawingml/2006/main" noChangeAspect="1"/>
+            </wp:cNvGraphicFramePr>
+            <a:graphic xmlns:a="http://schemas.openxmlformats.org/drawingml/2006/main">
+              <a:graphicData uri="http://schemas.openxmlformats.org/drawingml/2006/picture">
+                <pic:pic xmlns:pic="http://schemas.openxmlformats.org/drawingml/2006/picture">
+                  <pic:nvPicPr>
+                    <pic:cNvPr id="1566435807" name=""/>
+                    <pic:cNvPicPr/>
+                  </pic:nvPicPr>
+                  <pic:blipFill>
+                    <a:blip r:embed="rId10"/>
+                    <a:stretch>
+                      <a:fillRect/>
+                    </a:stretch>
+                  </pic:blipFill>
+                  <pic:spPr>
+                    <a:xfrm>
+                      <a:off x="0" y="0"/>
+                      <a:ext cx="6172200" cy="690245"/>
+                    </a:xfrm>
+                    <a:prstGeom prst="rect">
+                      <a:avLst/>
+                    </a:prstGeom>
+                  </pic:spPr>
+                </pic:pic>
+              </a:graphicData>
+            </a:graphic>
+          </wp:inline>
+        </w:drawing>
+      </w:r>
+    </w:p>
+    <w:p>
+      <w:pPr>
+        <w:pStyle w:val="TOC1"/>
+        <w:jc w:val="both"/>
+      </w:pPr>
+      <w:r>
+        <w:t>Este es el resultado en la consola</w:t>
+      </w:r>
+      <w:r>
+        <w:t xml:space="preserve">, vemos que </w:t>
+      </w:r>
+      <w:r>
+        <w:t>la factorial</w:t>
+      </w:r>
+      <w:r>
+        <w:t xml:space="preserve"> de 5 es 120, hagamos los cálculos.</w:t>
+      </w:r>
+    </w:p>
+    <w:p>
+      <w:pPr>
+        <w:pStyle w:val="TOC1"/>
+        <w:ind w:firstLine="720"/>
+        <w:jc w:val="both"/>
+      </w:pPr>
+      <w:r>
+        <w:t>5 * 4 * 3 * 2 * 1 = (20) * 3 * 2 * 1 = (60) * 2 * 1 = 120</w:t>
+      </w:r>
+    </w:p>
+    <w:p>
+      <w:pPr>
+        <w:pStyle w:val="TOC1"/>
+        <w:jc w:val="both"/>
+      </w:pPr>
+      <w:proofErr w:type="spellStart"/>
+      <w:r>
+        <w:t>Asi</w:t>
+      </w:r>
+      <w:proofErr w:type="spellEnd"/>
+      <w:r>
+        <w:t>, confirmamos que esta correcta la ecuación.</w:t>
+      </w:r>
+    </w:p>
+    <w:p>
+      <w:pPr>
+        <w:pStyle w:val="TOC1"/>
+        <w:jc w:val="both"/>
+      </w:pPr>
+      <w:r>
+        <w:t xml:space="preserve">Finalizamos con `Primo.asm`, En este ejercicio verificamos si un </w:t>
+      </w:r>
+      <w:r>
+        <w:t>número</w:t>
+      </w:r>
+      <w:r>
+        <w:t xml:space="preserve"> es primero.</w:t>
+      </w:r>
+    </w:p>
+    <w:p>
+      <w:pPr>
+        <w:pStyle w:val="TOC1"/>
+        <w:jc w:val="both"/>
+        <w:rPr>
+          <w:b/>
+          <w:bCs/>
+        </w:rPr>
+      </w:pPr>
+      <w:r>
+        <w:rPr>
+          <w:b/>
+          <w:bCs/>
+        </w:rPr>
+        <w:t>Verificar un valor primo</w:t>
+      </w:r>
+    </w:p>
+    <w:p>
+      <w:pPr>
+        <w:pStyle w:val="TOC1"/>
+        <w:jc w:val="both"/>
+      </w:pPr>
+      <w:r>
+        <w:t xml:space="preserve">Este </w:t>
+      </w:r>
+      <w:r>
+        <w:t>al final fue un poco mas extenso, pero no supuso un problema. En la captura de pantalla solo mostrare la función `_</w:t>
+      </w:r>
+      <w:proofErr w:type="spellStart"/>
+      <w:r>
+        <w:t>start</w:t>
+      </w:r>
+      <w:proofErr w:type="spellEnd"/>
+      <w:r>
+        <w:t>`, esto por lo extenso. El proceso fue el mismo que los otros dos, iniciando con `</w:t>
+      </w:r>
+      <w:proofErr w:type="spellStart"/>
+      <w:r>
+        <w:t>section</w:t>
+      </w:r>
+      <w:proofErr w:type="spellEnd"/>
+      <w:r>
+        <w:t xml:space="preserve"> .data` para definir las variables y los mensajes a imprimir, y luego con `</w:t>
+      </w:r>
+      <w:proofErr w:type="spellStart"/>
+      <w:r>
+        <w:t>section</w:t>
+      </w:r>
+      <w:proofErr w:type="spellEnd"/>
+      <w:r>
+        <w:t xml:space="preserve"> .</w:t>
+      </w:r>
+      <w:proofErr w:type="spellStart"/>
+      <w:r>
+        <w:t>text</w:t>
+      </w:r>
+      <w:proofErr w:type="spellEnd"/>
+      <w:r>
+        <w:t>` para definir la función `_</w:t>
+      </w:r>
+      <w:proofErr w:type="spellStart"/>
+      <w:r>
+        <w:t>start</w:t>
+      </w:r>
+      <w:proofErr w:type="spellEnd"/>
+      <w:r>
+        <w:t>` como global</w:t>
+      </w:r>
+      <w:r>
+        <w:t xml:space="preserve">. El primer paso en el </w:t>
+      </w:r>
+      <w:proofErr w:type="gramStart"/>
+      <w:r>
+        <w:t>código,</w:t>
+      </w:r>
+      <w:proofErr w:type="gramEnd"/>
+      <w:r>
+        <w:t xml:space="preserve"> es verificar si un valor ingresado es 1 o menor, como sabemos esto no son primos, ya sea 1 o 0.</w:t>
+      </w:r>
+      <w:r>
+        <w:t xml:space="preserve"> En caso de ingresados, saltamos a la función .</w:t>
+      </w:r>
+      <w:proofErr w:type="spellStart"/>
+      <w:r>
+        <w:t>no_primo</w:t>
+      </w:r>
+      <w:proofErr w:type="spellEnd"/>
+      <w:r>
+        <w:t>, para imprimir el mensaje de que no son primos, notificando al usuario del evento.</w:t>
+      </w:r>
+    </w:p>
+    <w:p>
+      <w:pPr>
+        <w:pStyle w:val="TOC1"/>
+        <w:jc w:val="both"/>
+      </w:pPr>
+      <w:r>
+        <w:t xml:space="preserve">Luego, iniciamos en la </w:t>
+      </w:r>
+      <w:proofErr w:type="gramStart"/>
+      <w:r>
+        <w:t>función .</w:t>
+      </w:r>
+      <w:proofErr w:type="spellStart"/>
+      <w:r>
+        <w:t>loop</w:t>
+      </w:r>
+      <w:proofErr w:type="spellEnd"/>
+      <w:proofErr w:type="gramEnd"/>
+      <w:r>
+        <w:t>, para verificar si el valor es primo, empezamos a dividir el valor ingresado desde 2, si se llega al valor ingresado, y el numero no fue dividido de forma entera, entonces se categoriza como primo, en tal caso de que se encuentre, notifica al usuario de que no es primo.</w:t>
+      </w:r>
+    </w:p>
+    <w:p>
+      <w:pPr>
+        <w:pStyle w:val="TOC1"/>
+        <w:jc w:val="both"/>
+      </w:pPr>
+    </w:p>
+    <w:p>
+      <w:pPr>
+        <w:pStyle w:val="TOC1"/>
+        <w:jc w:val="both"/>
+      </w:pPr>
+      <w:r>
+        <w:lastRenderedPageBreak/>
+        <w:drawing>
+          <wp:inline distT="0" distB="0" distL="0" distR="0" wp14:anchorId="0A93CD6A" wp14:editId="633C1580">
+            <wp:extent cx="5315692" cy="8230749"/>
+            <wp:effectExtent l="0" t="0" r="0" b="0"/>
+            <wp:docPr id="2041043910" name="Picture 1"/>
+            <wp:cNvGraphicFramePr>
+              <a:graphicFrameLocks xmlns:a="http://schemas.openxmlformats.org/drawingml/2006/main" noChangeAspect="1"/>
+            </wp:cNvGraphicFramePr>
+            <a:graphic xmlns:a="http://schemas.openxmlformats.org/drawingml/2006/main">
+              <a:graphicData uri="http://schemas.openxmlformats.org/drawingml/2006/picture">
+                <pic:pic xmlns:pic="http://schemas.openxmlformats.org/drawingml/2006/picture">
+                  <pic:nvPicPr>
+                    <pic:cNvPr id="2041043910" name=""/>
+                    <pic:cNvPicPr/>
+                  </pic:nvPicPr>
+                  <pic:blipFill>
+                    <a:blip r:embed="rId11"/>
+                    <a:stretch>
+                      <a:fillRect/>
+                    </a:stretch>
+                  </pic:blipFill>
+                  <pic:spPr>
+                    <a:xfrm>
+                      <a:off x="0" y="0"/>
+                      <a:ext cx="5315692" cy="8230749"/>
+                    </a:xfrm>
+                    <a:prstGeom prst="rect">
+                      <a:avLst/>
+                    </a:prstGeom>
+                  </pic:spPr>
+                </pic:pic>
+              </a:graphicData>
+            </a:graphic>
+          </wp:inline>
+        </w:drawing>
+      </w:r>
+    </w:p>
+    <w:p>
+      <w:pPr>
+        <w:pStyle w:val="TOC1"/>
+        <w:jc w:val="both"/>
+      </w:pPr>
+      <w:r>
+        <w:t>Veamos una ejecución de este programa</w:t>
+      </w:r>
+      <w:r>
+        <w:t>, el mismo proceso de ensamblado:</w:t>
+      </w:r>
+    </w:p>
+    <w:p>
+      <w:pPr>
+        <w:pStyle w:val="TOC1"/>
+        <w:ind w:firstLine="720"/>
+        <w:jc w:val="both"/>
+      </w:pPr>
+      <w:proofErr w:type="spellStart"/>
+      <w:r>
+        <w:t>nasm</w:t>
+      </w:r>
+      <w:proofErr w:type="spellEnd"/>
+      <w:r>
+        <w:t xml:space="preserve"> -f elf64</w:t>
+      </w:r>
+      <w:r>
+        <w:t xml:space="preserve"> Primo</w:t>
+      </w:r>
+      <w:r>
+        <w:t>.asm -o</w:t>
+      </w:r>
+      <w:r>
+        <w:t xml:space="preserve"> </w:t>
+      </w:r>
+      <w:proofErr w:type="spellStart"/>
+      <w:r>
+        <w:t>Primo</w:t>
+      </w:r>
+      <w:r>
+        <w:t>.o</w:t>
+      </w:r>
+      <w:proofErr w:type="spellEnd"/>
+      <w:r>
+        <w:t xml:space="preserve"> &amp;&amp; </w:t>
+      </w:r>
+      <w:proofErr w:type="spellStart"/>
+      <w:r>
+        <w:t>ld</w:t>
+      </w:r>
+      <w:proofErr w:type="spellEnd"/>
+      <w:r>
+        <w:t xml:space="preserve"> </w:t>
+      </w:r>
+      <w:proofErr w:type="spellStart"/>
+      <w:r>
+        <w:t>Primo</w:t>
+      </w:r>
+      <w:r>
+        <w:t>.o</w:t>
+      </w:r>
+      <w:proofErr w:type="spellEnd"/>
+      <w:r>
+        <w:t xml:space="preserve"> -o </w:t>
+      </w:r>
+      <w:r>
+        <w:t>Primo</w:t>
+      </w:r>
+    </w:p>
+    <w:p>
+      <w:pPr>
+        <w:pStyle w:val="TOC1"/>
+        <w:jc w:val="both"/>
+      </w:pPr>
+      <w:r>
+        <w:rPr>
+          <w:noProof/>
+        </w:rPr>
+        <w:lastRenderedPageBreak/>
+        <w:drawing>
+          <wp:inline distT="0" distB="0" distL="0" distR="0" wp14:anchorId="28E199D3" wp14:editId="1D0C6814">
+            <wp:extent cx="6172200" cy="1160145"/>
+            <wp:effectExtent l="0" t="0" r="0" b="1905"/>
+            <wp:docPr id="2049259740" name="Picture 1"/>
+            <wp:cNvGraphicFramePr>
+              <a:graphicFrameLocks xmlns:a="http://schemas.openxmlformats.org/drawingml/2006/main" noChangeAspect="1"/>
+            </wp:cNvGraphicFramePr>
+            <a:graphic xmlns:a="http://schemas.openxmlformats.org/drawingml/2006/main">
+              <a:graphicData uri="http://schemas.openxmlformats.org/drawingml/2006/picture">
+                <pic:pic xmlns:pic="http://schemas.openxmlformats.org/drawingml/2006/picture">
+                  <pic:nvPicPr>
+                    <pic:cNvPr id="2049259740" name=""/>
+                    <pic:cNvPicPr/>
+                  </pic:nvPicPr>
+                  <pic:blipFill>
+                    <a:blip r:embed="rId12"/>
+                    <a:stretch>
+                      <a:fillRect/>
+                    </a:stretch>
+                  </pic:blipFill>
+                  <pic:spPr>
+                    <a:xfrm>
+                      <a:off x="0" y="0"/>
+                      <a:ext cx="6172200" cy="1160145"/>
+                    </a:xfrm>
+                    <a:prstGeom prst="rect">
+                      <a:avLst/>
+                    </a:prstGeom>
+                  </pic:spPr>
+                </pic:pic>
+              </a:graphicData>
+            </a:graphic>
+          </wp:inline>
+        </w:drawing>
+      </w:r>
+    </w:p>
+    <w:p>
+      <w:pPr>
+        <w:pStyle w:val="TOC1"/>
+        <w:jc w:val="both"/>
+      </w:pPr>
+      <w:r>
+        <w:t>Vemos, que el 7 es primo, porque no hay numero el cual lo divida y el residuo de 0, en cambio el 4, no es primo, ya que 2 lo divide, dando como residuo 0.</w:t>
+      </w:r>
+    </w:p>
+    <w:p>
+      <w:pPr>
+        <w:jc w:val="both"/>
+        <w:rPr>
+          <w:sz w:val="24"/>
+          <w:szCs w:val="24"/>
+        </w:rPr>
+      </w:pPr>
+      <w:r>
+        <w:br w:type="page"/>
+      </w:r>
+    </w:p>
+    <w:p>
+      <w:pPr>
+        <w:pStyle w:val="Heading1"/>
+      </w:pPr>
+      <w:bookmarkStart w:id="14" w:name="_Toc233489402"/>
+      <w:r>
+        <w:lastRenderedPageBreak/>
+        <w:t>Conclusión</w:t>
+      </w:r>
+      <w:bookmarkEnd w:id="14"/>
+    </w:p>
+    <w:p>
+      <w:pPr>
+        <w:pStyle w:val="TOC1"/>
+        <w:jc w:val="both"/>
+      </w:pPr>
+      <w:r>
+        <w:t xml:space="preserve">El proceso de este laboratorio me ayudo a entender como funciona las maquinas, muchos códigos compilados a ensamblador pasan a este tipo de lenguaje, vemos que todos los pasos deben especificarse de forma explicita y ordenada, este se almacena en la memoria y registros, la creación de funciones y librerías también me ayudo a comprender como ha evolucionado la programación en </w:t>
+      </w:r>
+      <w:proofErr w:type="spellStart"/>
+      <w:r>
+        <w:t>si</w:t>
+      </w:r>
+      <w:proofErr w:type="spellEnd"/>
+      <w:r>
+        <w:t>. Actualmente podemos crear fácilmente una pagina web, o una aplicación móvil con la Inteligencia Artificial, pero pocos se preguntan el proceso que se tuvo que hacer para llegar a ese nivel. Aunque para comprender este código se debe investigar bastante, con un nivel básico de comprensión y analizando el código cuidadosamente, podemos deducir que hace cada línea, siendo lo mas complicado comprender los registros.</w:t>
+      </w:r>
+      <w:r>
+        <w:br w:type="page"/>
+      </w:r>
+    </w:p>
+    <w:p>
+      <w:pPr>
+        <w:pStyle w:val="Heading1"/>
+      </w:pPr>
+      <w:bookmarkStart w:id="15" w:name="_Toc233489403"/>
+      <w:r>
+        <w:lastRenderedPageBreak/>
+        <w:t>Bibliografía</w:t>
+      </w:r>
+      <w:bookmarkEnd w:id="15"/>
+    </w:p>
+    <w:p>
+      <w:pPr>
+        <w:pStyle w:val="Heading1"/>
+        <w:jc w:val="both"/>
+      </w:pPr>
+    </w:p>
+    <w:p>
+      <w:pPr>
+        <w:pStyle w:val="TOC1"/>
+        <w:jc w:val="both"/>
+        <w:rPr>
+          <w:lang w:val="en-US"/>
+        </w:rPr>
+      </w:pPr>
+      <w:r>
+        <w:rPr>
+          <w:lang w:val="en-US"/>
+        </w:rPr>
+        <w:t xml:space="preserve">(2009). 196793. Lists.ubuntu.com. </w:t>
+      </w:r>
+      <w:hyperlink r:id="rId13" w:history="1">
+        <w:r>
+          <w:rPr>
+            <w:rStyle w:val="Hyperlink"/>
+            <w:lang w:val="en-US"/>
+          </w:rPr>
+          <w:t>https://lists.ubuntu.com/archives/ubuntu-users/2009-September/196793.html</w:t>
+        </w:r>
+      </w:hyperlink>
+    </w:p>
+    <w:p>
+      <w:pPr>
+        <w:pStyle w:val="TOC1"/>
+        <w:jc w:val="both"/>
+        <w:rPr>
+          <w:lang w:val="en-US"/>
+        </w:rPr>
+      </w:pPr>
+      <w:r>
+        <w:rPr>
+          <w:lang w:val="en-US"/>
+        </w:rPr>
+        <w:t xml:space="preserve">(n.d.). What is assembly language. </w:t>
+      </w:r>
+      <w:proofErr w:type="spellStart"/>
+      <w:r>
+        <w:rPr>
+          <w:lang w:val="en-US"/>
+        </w:rPr>
+        <w:t>GeeksforGeeks</w:t>
+      </w:r>
+      <w:proofErr w:type="spellEnd"/>
+      <w:r>
+        <w:rPr>
+          <w:lang w:val="en-US"/>
+        </w:rPr>
+        <w:t xml:space="preserve">. </w:t>
+      </w:r>
+      <w:hyperlink r:id="rId14" w:history="1">
+        <w:r>
+          <w:rPr>
+            <w:rStyle w:val="Hyperlink"/>
+            <w:lang w:val="en-US"/>
+          </w:rPr>
+          <w:t>https://www.geeksforgeeks.org/computer-organization-architecture/what-is-assembly-language/</w:t>
+        </w:r>
+      </w:hyperlink>
+    </w:p>
+    <w:p>
+      <w:pPr>
+        <w:pStyle w:val="TOC1"/>
+        <w:jc w:val="both"/>
+        <w:rPr>
+          <w:lang w:val="en-US"/>
+        </w:rPr>
+      </w:pPr>
+      <w:r>
+        <w:rPr>
+          <w:lang w:val="en-US"/>
+        </w:rPr>
+        <w:t xml:space="preserve">(n.d.). Introduction of </w:t>
+      </w:r>
+      <w:proofErr w:type="gramStart"/>
+      <w:r>
+        <w:rPr>
+          <w:lang w:val="en-US"/>
+        </w:rPr>
+        <w:t>assembler</w:t>
+      </w:r>
+      <w:proofErr w:type="gramEnd"/>
+      <w:r>
+        <w:rPr>
+          <w:lang w:val="en-US"/>
+        </w:rPr>
+        <w:t xml:space="preserve">. </w:t>
+      </w:r>
+      <w:proofErr w:type="spellStart"/>
+      <w:r>
+        <w:rPr>
+          <w:lang w:val="en-US"/>
+        </w:rPr>
+        <w:t>GeeksforGeeks</w:t>
+      </w:r>
+      <w:proofErr w:type="spellEnd"/>
+      <w:r>
+        <w:rPr>
+          <w:lang w:val="en-US"/>
+        </w:rPr>
+        <w:t xml:space="preserve">. </w:t>
+      </w:r>
+      <w:hyperlink r:id="rId15" w:history="1">
+        <w:r>
+          <w:rPr>
+            <w:rStyle w:val="Hyperlink"/>
+            <w:lang w:val="en-US"/>
+          </w:rPr>
+          <w:t>https://www.geeksforgeeks.org/compiler-design/introduction-of-assembler/</w:t>
+        </w:r>
+      </w:hyperlink>
+    </w:p>
+    <w:p>
+      <w:pPr>
+        <w:pStyle w:val="TOC1"/>
+        <w:jc w:val="both"/>
+        <w:rPr>
+          <w:lang w:val="es-DO"/>
+        </w:rPr>
+      </w:pPr>
+      <w:r>
+        <w:rPr>
+          <w:lang w:val="en-US"/>
+        </w:rPr>
+        <w:t xml:space="preserve">(n.d.). Docs. </w:t>
+      </w:r>
+      <w:r>
+        <w:rPr>
+          <w:lang w:val="es-DO"/>
+        </w:rPr>
+        <w:t xml:space="preserve">Nasm.us. </w:t>
+      </w:r>
+      <w:hyperlink r:id="rId16" w:history="1">
+        <w:r>
+          <w:rPr>
+            <w:rStyle w:val="Hyperlink"/>
+            <w:lang w:val="es-DO"/>
+          </w:rPr>
+          <w:t>https://www.nasm.us/docs.html</w:t>
+        </w:r>
+      </w:hyperlink>
+    </w:p>
+    <w:p>
+      <w:pPr>
+        <w:pStyle w:val="TOC1"/>
+        <w:jc w:val="both"/>
+        <w:rPr>
+          <w:lang w:val="en-US"/>
+        </w:rPr>
+      </w:pPr>
+      <w:r>
+        <w:rPr>
+          <w:lang w:val="en-US"/>
+        </w:rPr>
+        <w:t xml:space="preserve">Charles David. (n.d.). Linux64io. GitHub. </w:t>
+      </w:r>
+      <w:hyperlink r:id="rId17" w:history="1">
+        <w:r>
+          <w:rPr>
+            <w:rStyle w:val="Hyperlink"/>
+            <w:lang w:val="en-US"/>
+          </w:rPr>
+          <w:t>https://github.com/InuzDev/linux64io</w:t>
+        </w:r>
+      </w:hyperlink>
+    </w:p>
+    <w:p>
+      <w:pPr>
+        <w:pStyle w:val="TOC1"/>
+        <w:rPr>
+          <w:lang w:val="en-US"/>
         </w:rPr>
       </w:pPr>
     </w:p>
@@ -1144,6 +2694,119 @@
 <file path=word/numbering.xml><?xml version="1.0" encoding="utf-8"?>
 <w:numbering xmlns:wpc="http://schemas.microsoft.com/office/word/2010/wordprocessingCanvas" xmlns:cx="http://schemas.microsoft.com/office/drawing/2014/chartex" xmlns:cx1="http://schemas.microsoft.com/office/drawing/2015/9/8/chartex" xmlns:cx2="http://schemas.microsoft.com/office/drawing/2015/10/21/chartex" xmlns:cx3="http://schemas.microsoft.com/office/drawing/2016/5/9/chartex" xmlns:cx4="http://schemas.microsoft.com/office/drawing/2016/5/10/chartex" xmlns:cx5="http://schemas.microsoft.com/office/drawing/2016/5/11/chartex" xmlns:cx6="http://schemas.microsoft.com/office/drawing/2016/5/12/chartex" xmlns:cx7="http://schemas.microsoft.com/office/drawing/2016/5/13/chartex" xmlns:cx8="http://schemas.microsoft.com/office/drawing/2016/5/14/chartex" xmlns:mc="http://schemas.openxmlformats.org/markup-compatibility/2006" xmlns:aink="http://schemas.microsoft.com/office/drawing/2016/ink" xmlns:am3d="http://schemas.microsoft.com/office/drawing/2017/model3d" xmlns:o="urn:schemas-microsoft-com:office:office" xmlns:oel="http://schemas.microsoft.com/office/2019/extlst" xmlns:r="http://schemas.openxmlformats.org/officeDocument/2006/relationships" xmlns:m="http://schemas.openxmlformats.org/officeDocument/2006/math" xmlns:v="urn:schemas-microsoft-com:vml" xmlns:wp14="http://schemas.microsoft.com/office/word/2010/wordprocessingDrawing" xmlns:wp="http://schemas.openxmlformats.org/drawingml/2006/wordprocessingDrawing" xmlns:w10="urn:schemas-microsoft-com:office:word" xmlns:w="http://schemas.openxmlformats.org/wordprocessingml/2006/main" xmlns:w14="http://schemas.microsoft.com/office/word/2010/wordml" xmlns:w15="http://schemas.microsoft.com/office/word/2012/wordml" xmlns:w16cex="http://schemas.microsoft.com/office/word/2018/wordml/cex" xmlns:w16cid="http://schemas.microsoft.com/office/word/2016/wordml/cid" xmlns:w16="http://schemas.microsoft.com/office/word/2018/wordml" xmlns:w16du="http://schemas.microsoft.com/office/word/2023/wordml/word16du" xmlns:w16sdtdh="http://schemas.microsoft.com/office/word/2020/wordml/sdtdatahash" xmlns:w16sdtfl="http://schemas.microsoft.com/office/word/2024/wordml/sdtformatlock" xmlns:w16se="http://schemas.microsoft.com/office/word/2015/wordml/symex" xmlns:wpg="http://schemas.microsoft.com/office/word/2010/wordprocessingGroup" xmlns:wpi="http://schemas.microsoft.com/office/word/2010/wordprocessingInk" xmlns:wne="http://schemas.microsoft.com/office/word/2006/wordml" xmlns:wps="http://schemas.microsoft.com/office/word/2010/wordprocessingShape" mc:Ignorable="w14 w15 w16se w16cid w16 w16cex w16sdtdh w16sdtfl w16du wp14">
   <w:abstractNum w:abstractNumId="0" w15:restartNumberingAfterBreak="0">
+    <w:nsid w:val="0F1B3D85"/>
+    <w:multiLevelType w:val="hybridMultilevel"/>
+    <w:tmpl w:val="05A4E0B2"/>
+    <w:lvl w:ilvl="0" w:tplc="04090001">
+      <w:start w:val="14"/>
+      <w:numFmt w:val="bullet"/>
+      <w:lvlText w:val=""/>
+      <w:lvlJc w:val="left"/>
+      <w:pPr>
+        <w:ind w:left="720" w:hanging="360"/>
+      </w:pPr>
+      <w:rPr>
+        <w:rFonts w:ascii="Symbol" w:eastAsia="Times New Roman" w:hAnsi="Symbol" w:cs="Times New Roman" w:hint="default"/>
+      </w:rPr>
+    </w:lvl>
+    <w:lvl w:ilvl="1" w:tplc="04090003" w:tentative="1">
+      <w:start w:val="1"/>
+      <w:numFmt w:val="bullet"/>
+      <w:lvlText w:val="o"/>
+      <w:lvlJc w:val="left"/>
+      <w:pPr>
+        <w:ind w:left="1440" w:hanging="360"/>
+      </w:pPr>
+      <w:rPr>
+        <w:rFonts w:ascii="Courier New" w:hAnsi="Courier New" w:cs="Courier New" w:hint="default"/>
+      </w:rPr>
+    </w:lvl>
+    <w:lvl w:ilvl="2" w:tplc="04090005" w:tentative="1">
+      <w:start w:val="1"/>
+      <w:numFmt w:val="bullet"/>
+      <w:lvlText w:val=""/>
+      <w:lvlJc w:val="left"/>
+      <w:pPr>
+        <w:ind w:left="2160" w:hanging="360"/>
+      </w:pPr>
+      <w:rPr>
+        <w:rFonts w:ascii="Wingdings" w:hAnsi="Wingdings" w:hint="default"/>
+      </w:rPr>
+    </w:lvl>
+    <w:lvl w:ilvl="3" w:tplc="04090001" w:tentative="1">
+      <w:start w:val="1"/>
+      <w:numFmt w:val="bullet"/>
+      <w:lvlText w:val=""/>
+      <w:lvlJc w:val="left"/>
+      <w:pPr>
+        <w:ind w:left="2880" w:hanging="360"/>
+      </w:pPr>
+      <w:rPr>
+        <w:rFonts w:ascii="Symbol" w:hAnsi="Symbol" w:hint="default"/>
+      </w:rPr>
+    </w:lvl>
+    <w:lvl w:ilvl="4" w:tplc="04090003" w:tentative="1">
+      <w:start w:val="1"/>
+      <w:numFmt w:val="bullet"/>
+      <w:lvlText w:val="o"/>
+      <w:lvlJc w:val="left"/>
+      <w:pPr>
+        <w:ind w:left="3600" w:hanging="360"/>
+      </w:pPr>
+      <w:rPr>
+        <w:rFonts w:ascii="Courier New" w:hAnsi="Courier New" w:cs="Courier New" w:hint="default"/>
+      </w:rPr>
+    </w:lvl>
+    <w:lvl w:ilvl="5" w:tplc="04090005" w:tentative="1">
+      <w:start w:val="1"/>
+      <w:numFmt w:val="bullet"/>
+      <w:lvlText w:val=""/>
+      <w:lvlJc w:val="left"/>
+      <w:pPr>
+        <w:ind w:left="4320" w:hanging="360"/>
+      </w:pPr>
+      <w:rPr>
+        <w:rFonts w:ascii="Wingdings" w:hAnsi="Wingdings" w:hint="default"/>
+      </w:rPr>
+    </w:lvl>
+    <w:lvl w:ilvl="6" w:tplc="04090001" w:tentative="1">
+      <w:start w:val="1"/>
+      <w:numFmt w:val="bullet"/>
+      <w:lvlText w:val=""/>
+      <w:lvlJc w:val="left"/>
+      <w:pPr>
+        <w:ind w:left="5040" w:hanging="360"/>
+      </w:pPr>
+      <w:rPr>
+        <w:rFonts w:ascii="Symbol" w:hAnsi="Symbol" w:hint="default"/>
+      </w:rPr>
+    </w:lvl>
+    <w:lvl w:ilvl="7" w:tplc="04090003" w:tentative="1">
+      <w:start w:val="1"/>
+      <w:numFmt w:val="bullet"/>
+      <w:lvlText w:val="o"/>
+      <w:lvlJc w:val="left"/>
+      <w:pPr>
+        <w:ind w:left="5760" w:hanging="360"/>
+      </w:pPr>
+      <w:rPr>
+        <w:rFonts w:ascii="Courier New" w:hAnsi="Courier New" w:cs="Courier New" w:hint="default"/>
+      </w:rPr>
+    </w:lvl>
+    <w:lvl w:ilvl="8" w:tplc="04090005" w:tentative="1">
+      <w:start w:val="1"/>
+      <w:numFmt w:val="bullet"/>
+      <w:lvlText w:val=""/>
+      <w:lvlJc w:val="left"/>
+      <w:pPr>
+        <w:ind w:left="6480" w:hanging="360"/>
+      </w:pPr>
+      <w:rPr>
+        <w:rFonts w:ascii="Wingdings" w:hAnsi="Wingdings" w:hint="default"/>
+      </w:rPr>
+    </w:lvl>
+  </w:abstractNum>
+  <w:abstractNum w:abstractNumId="1" w15:restartNumberingAfterBreak="0">
     <w:nsid w:val="50A179E9"/>
     <w:multiLevelType w:val="hybridMultilevel"/>
     <w:tmpl w:val="5E36BDB4"/>
@@ -1280,7 +2943,7 @@
       </w:rPr>
     </w:lvl>
   </w:abstractNum>
-  <w:abstractNum w:abstractNumId="1" w15:restartNumberingAfterBreak="0">
+  <w:abstractNum w:abstractNumId="2" w15:restartNumberingAfterBreak="0">
     <w:nsid w:val="5FFF7555"/>
     <w:multiLevelType w:val="hybridMultilevel"/>
     <w:tmpl w:val="220A4528"/>
@@ -1413,7 +3076,7 @@
       </w:rPr>
     </w:lvl>
   </w:abstractNum>
-  <w:abstractNum w:abstractNumId="2" w15:restartNumberingAfterBreak="0">
+  <w:abstractNum w:abstractNumId="3" w15:restartNumberingAfterBreak="0">
     <w:nsid w:val="768E7877"/>
     <w:multiLevelType w:val="hybridMultilevel"/>
     <w:tmpl w:val="77B026D2"/>
@@ -1535,13 +3198,16 @@
     </w:lvl>
   </w:abstractNum>
   <w:num w:numId="1" w16cid:durableId="1850296102">
-    <w:abstractNumId w:val="0"/>
+    <w:abstractNumId w:val="1"/>
   </w:num>
   <w:num w:numId="2" w16cid:durableId="1345595587">
-    <w:abstractNumId w:val="1"/>
+    <w:abstractNumId w:val="2"/>
   </w:num>
   <w:num w:numId="3" w16cid:durableId="857739031">
-    <w:abstractNumId w:val="2"/>
+    <w:abstractNumId w:val="3"/>
+  </w:num>
+  <w:num w:numId="4" w16cid:durableId="1580944995">
+    <w:abstractNumId w:val="0"/>
   </w:num>
 </w:numbering>
 </file>
@@ -2012,7 +3678,7 @@
   <w:style w:type="paragraph" w:styleId="TOC1">
     <w:name w:val="toc 1"/>
     <w:basedOn w:val="Normal"/>
-    <w:uiPriority w:val="1"/>
+    <w:uiPriority w:val="39"/>
     <w:qFormat/>
     <w:pPr>
       <w:spacing w:before="101"/>
@@ -2097,6 +3763,57 @@
     <w:pPr>
       <w:spacing w:line="275" w:lineRule="exact"/>
     </w:pPr>
+  </w:style>
+  <w:style w:type="character" w:styleId="Hyperlink">
+    <w:name w:val="Hyperlink"/>
+    <w:basedOn w:val="DefaultParagraphFont"/>
+    <w:uiPriority w:val="99"/>
+    <w:unhideWhenUsed/>
+    <w:rsid w:val="000B49E3"/>
+    <w:rPr>
+      <w:color w:val="0000FF" w:themeColor="hyperlink"/>
+      <w:u w:val="single"/>
+    </w:rPr>
+  </w:style>
+  <w:style w:type="character" w:styleId="UnresolvedMention">
+    <w:name w:val="Unresolved Mention"/>
+    <w:basedOn w:val="DefaultParagraphFont"/>
+    <w:uiPriority w:val="99"/>
+    <w:semiHidden/>
+    <w:unhideWhenUsed/>
+    <w:rsid w:val="000B49E3"/>
+    <w:rPr>
+      <w:color w:val="605E5C"/>
+      <w:shd w:val="clear" w:color="auto" w:fill="E1DFDD"/>
+    </w:rPr>
+  </w:style>
+  <w:style w:type="paragraph" w:styleId="TOCHeading">
+    <w:name w:val="TOC Heading"/>
+    <w:basedOn w:val="Heading1"/>
+    <w:next w:val="Normal"/>
+    <w:uiPriority w:val="39"/>
+    <w:unhideWhenUsed/>
+    <w:qFormat/>
+    <w:rsid w:val="00356EF8"/>
+    <w:pPr>
+      <w:keepNext/>
+      <w:keepLines/>
+      <w:widowControl/>
+      <w:autoSpaceDE/>
+      <w:autoSpaceDN/>
+      <w:spacing w:before="240" w:line="259" w:lineRule="auto"/>
+      <w:jc w:val="left"/>
+      <w:outlineLvl w:val="9"/>
+    </w:pPr>
+    <w:rPr>
+      <w:rFonts w:asciiTheme="majorHAnsi" w:eastAsiaTheme="majorEastAsia" w:hAnsiTheme="majorHAnsi" w:cstheme="majorBidi"/>
+      <w:b w:val="0"/>
+      <w:bCs w:val="0"/>
+      <w:color w:val="365F91" w:themeColor="accent1" w:themeShade="BF"/>
+      <w:sz w:val="32"/>
+      <w:szCs w:val="32"/>
+      <w:lang w:val="en-US"/>
+    </w:rPr>
   </w:style>
 </w:styles>
 </file>
@@ -2382,4 +4099,16 @@
   <a:objectDefaults/>
   <a:extraClrSchemeLst/>
 </a:theme>
+</file>
+
+<file path=customXml/item1.xml><?xml version="1.0" encoding="utf-8"?>
+<b:Sources xmlns:b="http://schemas.openxmlformats.org/officeDocument/2006/bibliography" xmlns="http://schemas.openxmlformats.org/officeDocument/2006/bibliography" SelectedStyle="\APASixthEditionOfficeOnline.xsl" StyleName="APA" Version="6"/>
+</file>
+
+<file path=customXml/itemProps1.xml><?xml version="1.0" encoding="utf-8"?>
+<ds:datastoreItem xmlns:ds="http://schemas.openxmlformats.org/officeDocument/2006/customXml" ds:itemID="{F7AFDC7B-5584-4515-A3DF-2769E4AD2535}">
+  <ds:schemaRefs>
+    <ds:schemaRef ds:uri="http://schemas.openxmlformats.org/officeDocument/2006/bibliography"/>
+  </ds:schemaRefs>
+</ds:datastoreItem>
 </file>
</xml_diff>